<commit_message>
V19: Completed Perc. I fixes and Minor changes. To do Major edits and percussion edits. Reorg Prev Versions folder
</commit_message>
<xml_diff>
--- a/2 Proofreading and Review/LARA Mosaic Maze - Errata_v1 (Page 1-60).docx
+++ b/2 Proofreading and Review/LARA Mosaic Maze - Errata_v1 (Page 1-60).docx
@@ -931,7 +931,21 @@
               <w:rPr>
                 <w:rFonts w:ascii="Times" w:eastAsia="Times" w:hAnsi="Times" w:cs="Times"/>
               </w:rPr>
-              <w:t xml:space="preserve">Last beat, wbl. </w:t>
+              <w:t xml:space="preserve">Last beat, </w:t>
+            </w:r>
+            <w:proofErr w:type="spellStart"/>
+            <w:r>
+              <w:rPr>
+                <w:rFonts w:ascii="Times" w:eastAsia="Times" w:hAnsi="Times" w:cs="Times"/>
+              </w:rPr>
+              <w:t>wbl</w:t>
+            </w:r>
+            <w:proofErr w:type="spellEnd"/>
+            <w:r>
+              <w:rPr>
+                <w:rFonts w:ascii="Times" w:eastAsia="Times" w:hAnsi="Times" w:cs="Times"/>
+              </w:rPr>
+              <w:t xml:space="preserve">. </w:t>
             </w:r>
             <w:r>
               <w:rPr>
@@ -1093,11 +1107,19 @@
                 <w:rFonts w:ascii="Times" w:eastAsia="Times" w:hAnsi="Times" w:cs="Times"/>
               </w:rPr>
             </w:pPr>
-            <w:r>
-              <w:rPr>
-                <w:rFonts w:ascii="Times" w:eastAsia="Times" w:hAnsi="Times" w:cs="Times"/>
-              </w:rPr>
-              <w:t xml:space="preserve">Cresc. from </w:t>
+            <w:proofErr w:type="spellStart"/>
+            <w:r>
+              <w:rPr>
+                <w:rFonts w:ascii="Times" w:eastAsia="Times" w:hAnsi="Times" w:cs="Times"/>
+              </w:rPr>
+              <w:t>Cresc</w:t>
+            </w:r>
+            <w:proofErr w:type="spellEnd"/>
+            <w:r>
+              <w:rPr>
+                <w:rFonts w:ascii="Times" w:eastAsia="Times" w:hAnsi="Times" w:cs="Times"/>
+              </w:rPr>
+              <w:t xml:space="preserve">. from </w:t>
             </w:r>
             <w:r>
               <w:rPr>
@@ -1113,6 +1135,7 @@
               </w:rPr>
               <w:t xml:space="preserve"> to </w:t>
             </w:r>
+            <w:proofErr w:type="spellStart"/>
             <w:r>
               <w:rPr>
                 <w:rFonts w:ascii="Times" w:eastAsia="Times" w:hAnsi="Times" w:cs="Times"/>
@@ -1121,6 +1144,7 @@
               </w:rPr>
               <w:t>mf</w:t>
             </w:r>
+            <w:proofErr w:type="spellEnd"/>
             <w:r>
               <w:rPr>
                 <w:rFonts w:ascii="Times" w:eastAsia="Times" w:hAnsi="Times" w:cs="Times"/>
@@ -2426,8 +2450,13 @@
             <w:pPr>
               <w:jc w:val="center"/>
             </w:pPr>
-            <w:r>
-              <w:t>Vln II</w:t>
+            <w:proofErr w:type="spellStart"/>
+            <w:r>
+              <w:t>Vln</w:t>
+            </w:r>
+            <w:proofErr w:type="spellEnd"/>
+            <w:r>
+              <w:t xml:space="preserve"> II</w:t>
             </w:r>
           </w:p>
         </w:tc>
@@ -2612,7 +2641,21 @@
               <w:rPr>
                 <w:rFonts w:ascii="Times" w:eastAsia="Times" w:hAnsi="Times" w:cs="Times"/>
               </w:rPr>
-              <w:t>Should we use a + sign for gestopft or just an x? This note has an x notehead with staccato, but the others don’t have staccato and use “+”. Let me know the preferred notation.</w:t>
+              <w:t xml:space="preserve">Should we use a + sign for </w:t>
+            </w:r>
+            <w:proofErr w:type="spellStart"/>
+            <w:r>
+              <w:rPr>
+                <w:rFonts w:ascii="Times" w:eastAsia="Times" w:hAnsi="Times" w:cs="Times"/>
+              </w:rPr>
+              <w:t>gestopft</w:t>
+            </w:r>
+            <w:proofErr w:type="spellEnd"/>
+            <w:r>
+              <w:rPr>
+                <w:rFonts w:ascii="Times" w:eastAsia="Times" w:hAnsi="Times" w:cs="Times"/>
+              </w:rPr>
+              <w:t xml:space="preserve"> or just an x? This note has an x notehead with staccato, but the others don’t have staccato and use “+”. Let me know the preferred notation.</w:t>
             </w:r>
           </w:p>
         </w:tc>
@@ -2647,7 +2690,21 @@
               <w:rPr>
                 <w:rFonts w:ascii="Times" w:eastAsia="Times" w:hAnsi="Times" w:cs="Times"/>
               </w:rPr>
-              <w:t>X, gestopft, and staccato, as score, but add a +</w:t>
+              <w:t xml:space="preserve">X, </w:t>
+            </w:r>
+            <w:proofErr w:type="spellStart"/>
+            <w:r>
+              <w:rPr>
+                <w:rFonts w:ascii="Times" w:eastAsia="Times" w:hAnsi="Times" w:cs="Times"/>
+              </w:rPr>
+              <w:t>gestopft</w:t>
+            </w:r>
+            <w:proofErr w:type="spellEnd"/>
+            <w:r>
+              <w:rPr>
+                <w:rFonts w:ascii="Times" w:eastAsia="Times" w:hAnsi="Times" w:cs="Times"/>
+              </w:rPr>
+              <w:t>, and staccato, as score, but add a +</w:t>
             </w:r>
           </w:p>
         </w:tc>
@@ -4120,6 +4177,7 @@
               </w:rPr>
               <w:t xml:space="preserve">Changed </w:t>
             </w:r>
+            <w:proofErr w:type="spellStart"/>
             <w:r>
               <w:rPr>
                 <w:rFonts w:ascii="Times" w:eastAsia="Times" w:hAnsi="Times" w:cs="Times"/>
@@ -4128,12 +4186,14 @@
               </w:rPr>
               <w:t>ppp</w:t>
             </w:r>
+            <w:proofErr w:type="spellEnd"/>
             <w:r>
               <w:rPr>
                 <w:rFonts w:ascii="Times" w:eastAsia="Times" w:hAnsi="Times" w:cs="Times"/>
               </w:rPr>
               <w:t xml:space="preserve"> to </w:t>
             </w:r>
+            <w:proofErr w:type="spellStart"/>
             <w:r>
               <w:rPr>
                 <w:rFonts w:ascii="Times" w:eastAsia="Times" w:hAnsi="Times" w:cs="Times"/>
@@ -4142,12 +4202,14 @@
               </w:rPr>
               <w:t>pppp</w:t>
             </w:r>
+            <w:proofErr w:type="spellEnd"/>
             <w:r>
               <w:rPr>
                 <w:rFonts w:ascii="Times" w:eastAsia="Times" w:hAnsi="Times" w:cs="Times"/>
               </w:rPr>
               <w:t xml:space="preserve"> (there are 13 attacks which always end with </w:t>
             </w:r>
+            <w:proofErr w:type="spellStart"/>
             <w:r>
               <w:rPr>
                 <w:rFonts w:ascii="Times" w:eastAsia="Times" w:hAnsi="Times" w:cs="Times"/>
@@ -4156,6 +4218,7 @@
               </w:rPr>
               <w:t>pppp</w:t>
             </w:r>
+            <w:proofErr w:type="spellEnd"/>
             <w:r>
               <w:rPr>
                 <w:rFonts w:ascii="Times" w:eastAsia="Times" w:hAnsi="Times" w:cs="Times"/>
@@ -4820,7 +4883,21 @@
               <w:rPr>
                 <w:rFonts w:ascii="Times" w:eastAsia="Times" w:hAnsi="Times" w:cs="Times"/>
               </w:rPr>
-              <w:t>Make percussion mp (untilm140); all other attacks ff</w:t>
+              <w:t xml:space="preserve">Make percussion </w:t>
+            </w:r>
+            <w:proofErr w:type="spellStart"/>
+            <w:r>
+              <w:rPr>
+                <w:rFonts w:ascii="Times" w:eastAsia="Times" w:hAnsi="Times" w:cs="Times"/>
+              </w:rPr>
+              <w:t>mp</w:t>
+            </w:r>
+            <w:proofErr w:type="spellEnd"/>
+            <w:r>
+              <w:rPr>
+                <w:rFonts w:ascii="Times" w:eastAsia="Times" w:hAnsi="Times" w:cs="Times"/>
+              </w:rPr>
+              <w:t xml:space="preserve"> (untilm140); all other attacks ff</w:t>
             </w:r>
           </w:p>
         </w:tc>
@@ -5777,13 +5854,41 @@
               <w:rPr>
                 <w:rFonts w:ascii="Times" w:eastAsia="Times" w:hAnsi="Times" w:cs="Times"/>
               </w:rPr>
-              <w:t>Since the last note isn’t a sustaining note (only on bass drum), what if we just put the 4” fermata on the barline like in other instances?</w:t>
-            </w:r>
-            <w:r>
-              <w:rPr>
-                <w:rFonts w:ascii="Times" w:eastAsia="Times" w:hAnsi="Times" w:cs="Times"/>
-              </w:rPr>
-              <w:t xml:space="preserve"> We can add an l.v. on the bass drum to ensure they know to keep the ring for those 4 seconds.</w:t>
+              <w:t xml:space="preserve">Since the last note isn’t a sustaining note (only on bass drum), what if we just put the 4” fermata on the </w:t>
+            </w:r>
+            <w:proofErr w:type="spellStart"/>
+            <w:r>
+              <w:rPr>
+                <w:rFonts w:ascii="Times" w:eastAsia="Times" w:hAnsi="Times" w:cs="Times"/>
+              </w:rPr>
+              <w:t>barline</w:t>
+            </w:r>
+            <w:proofErr w:type="spellEnd"/>
+            <w:r>
+              <w:rPr>
+                <w:rFonts w:ascii="Times" w:eastAsia="Times" w:hAnsi="Times" w:cs="Times"/>
+              </w:rPr>
+              <w:t xml:space="preserve"> like in other instances?</w:t>
+            </w:r>
+            <w:r>
+              <w:rPr>
+                <w:rFonts w:ascii="Times" w:eastAsia="Times" w:hAnsi="Times" w:cs="Times"/>
+              </w:rPr>
+              <w:t xml:space="preserve"> We can add an </w:t>
+            </w:r>
+            <w:proofErr w:type="spellStart"/>
+            <w:r>
+              <w:rPr>
+                <w:rFonts w:ascii="Times" w:eastAsia="Times" w:hAnsi="Times" w:cs="Times"/>
+              </w:rPr>
+              <w:t>l.v.</w:t>
+            </w:r>
+            <w:proofErr w:type="spellEnd"/>
+            <w:r>
+              <w:rPr>
+                <w:rFonts w:ascii="Times" w:eastAsia="Times" w:hAnsi="Times" w:cs="Times"/>
+              </w:rPr>
+              <w:t xml:space="preserve"> on the bass drum to ensure they know to keep the ring for those 4 seconds.</w:t>
             </w:r>
           </w:p>
         </w:tc>
@@ -5885,7 +5990,33 @@
           <w:bCs/>
         </w:rPr>
         <w:lastRenderedPageBreak/>
-        <w:t>Additional Notes</w:t>
+        <w:t xml:space="preserve">Initial </w:t>
+      </w:r>
+      <w:r>
+        <w:rPr>
+          <w:b/>
+          <w:bCs/>
+        </w:rPr>
+        <w:t>Notes</w:t>
+      </w:r>
+      <w:r>
+        <w:rPr>
+          <w:b/>
+          <w:bCs/>
+        </w:rPr>
+        <w:t xml:space="preserve"> </w:t>
+      </w:r>
+      <w:r>
+        <w:t>(3</w:t>
+      </w:r>
+      <w:r>
+        <w:rPr>
+          <w:vertAlign w:val="superscript"/>
+        </w:rPr>
+        <w:t>rd</w:t>
+      </w:r>
+      <w:r>
+        <w:t xml:space="preserve"> March 2024)</w:t>
       </w:r>
     </w:p>
     <w:p>
@@ -5939,7 +6070,15 @@
         </w:numPr>
       </w:pPr>
       <w:r>
-        <w:t>M8; vla; I prefer to subdivide one quarter tied to two tied eight notes tied to etc…</w:t>
+        <w:t xml:space="preserve">M8; </w:t>
+      </w:r>
+      <w:proofErr w:type="spellStart"/>
+      <w:r>
+        <w:t>vla</w:t>
+      </w:r>
+      <w:proofErr w:type="spellEnd"/>
+      <w:r>
+        <w:t>; I prefer to subdivide one quarter tied to two tied eight notes tied to etc…</w:t>
       </w:r>
     </w:p>
     <w:p>
@@ -6022,7 +6161,15 @@
         </w:numPr>
       </w:pPr>
       <w:r>
-        <w:t>M12-13, sax, I made a mistake, should be crawling down by ¼ tone; D nat gradually down to C</w:t>
+        <w:t xml:space="preserve">M12-13, sax, I made a mistake, should be crawling down by ¼ tone; D </w:t>
+      </w:r>
+      <w:proofErr w:type="spellStart"/>
+      <w:r>
+        <w:t>nat</w:t>
+      </w:r>
+      <w:proofErr w:type="spellEnd"/>
+      <w:r>
+        <w:t xml:space="preserve"> gradually down to C</w:t>
       </w:r>
     </w:p>
     <w:p>
@@ -6247,7 +6394,15 @@
         </w:numPr>
       </w:pPr>
       <w:r>
-        <w:t>M37, Perc 1 and 2; please fix both attacks where gracenotes are not aligned with attack</w:t>
+        <w:t xml:space="preserve">M37, Perc 1 and 2; please fix both attacks where </w:t>
+      </w:r>
+      <w:proofErr w:type="spellStart"/>
+      <w:r>
+        <w:t>gracenotes</w:t>
+      </w:r>
+      <w:proofErr w:type="spellEnd"/>
+      <w:r>
+        <w:t xml:space="preserve"> are not aligned with attack</w:t>
       </w:r>
     </w:p>
     <w:p>
@@ -6448,7 +6603,23 @@
         </w:numPr>
       </w:pPr>
       <w:r>
-        <w:t>M46, fl, ob, cl, please add beam even though start with rest to show the beat better</w:t>
+        <w:t xml:space="preserve">M46, </w:t>
+      </w:r>
+      <w:proofErr w:type="spellStart"/>
+      <w:r>
+        <w:t>fl</w:t>
+      </w:r>
+      <w:proofErr w:type="spellEnd"/>
+      <w:r>
+        <w:t xml:space="preserve">, </w:t>
+      </w:r>
+      <w:proofErr w:type="spellStart"/>
+      <w:r>
+        <w:t>ob</w:t>
+      </w:r>
+      <w:proofErr w:type="spellEnd"/>
+      <w:r>
+        <w:t>, cl, please add beam even though start with rest to show the beat better</w:t>
       </w:r>
     </w:p>
     <w:p>
@@ -6469,7 +6640,23 @@
         </w:numPr>
       </w:pPr>
       <w:r>
-        <w:t>M48, , fl, ob, cl, please add beam even though start with rest to show the beat better</w:t>
+        <w:t xml:space="preserve">M48, , </w:t>
+      </w:r>
+      <w:proofErr w:type="spellStart"/>
+      <w:r>
+        <w:t>fl</w:t>
+      </w:r>
+      <w:proofErr w:type="spellEnd"/>
+      <w:r>
+        <w:t xml:space="preserve">, </w:t>
+      </w:r>
+      <w:proofErr w:type="spellStart"/>
+      <w:r>
+        <w:t>ob</w:t>
+      </w:r>
+      <w:proofErr w:type="spellEnd"/>
+      <w:r>
+        <w:t>, cl, please add beam even though start with rest to show the beat better</w:t>
       </w:r>
     </w:p>
     <w:p>
@@ -6574,7 +6761,15 @@
         </w:numPr>
       </w:pPr>
       <w:r>
-        <w:t>M55, strings, please add beam even though start with rest to show the beat better…vl2 and vla (beat 1); vl1 (beat 2); cello (beat 3)</w:t>
+        <w:t xml:space="preserve">M55, strings, please add beam even though start with rest to show the beat better…vl2 and </w:t>
+      </w:r>
+      <w:proofErr w:type="spellStart"/>
+      <w:r>
+        <w:t>vla</w:t>
+      </w:r>
+      <w:proofErr w:type="spellEnd"/>
+      <w:r>
+        <w:t xml:space="preserve"> (beat 1); vl1 (beat 2); cello (beat 3)</w:t>
       </w:r>
     </w:p>
     <w:p/>
@@ -6587,7 +6782,15 @@
         </w:numPr>
       </w:pPr>
       <w:r>
-        <w:t xml:space="preserve">M56, strings, please add beam even though start with rest to show the beat better; vla (beat 1); vl2 (beat 2), cello (beats 3 and 4); </w:t>
+        <w:t xml:space="preserve">M56, strings, please add beam even though start with rest to show the beat better; </w:t>
+      </w:r>
+      <w:proofErr w:type="spellStart"/>
+      <w:r>
+        <w:t>vla</w:t>
+      </w:r>
+      <w:proofErr w:type="spellEnd"/>
+      <w:r>
+        <w:t xml:space="preserve"> (beat 1); vl2 (beat 2), cello (beats 3 and 4); </w:t>
       </w:r>
     </w:p>
     <w:p>
@@ -6604,7 +6807,15 @@
         </w:numPr>
       </w:pPr>
       <w:r>
-        <w:t>M57, strings, please add beam even though start with rest to show the beat better; vla (beats 1 and 3)</w:t>
+        <w:t xml:space="preserve">M57, strings, please add beam even though start with rest to show the beat better; </w:t>
+      </w:r>
+      <w:proofErr w:type="spellStart"/>
+      <w:r>
+        <w:t>vla</w:t>
+      </w:r>
+      <w:proofErr w:type="spellEnd"/>
+      <w:r>
+        <w:t xml:space="preserve"> (beats 1 and 3)</w:t>
       </w:r>
     </w:p>
     <w:p>
@@ -6660,7 +6871,15 @@
       </w:pPr>
       <w:r>
         <w:lastRenderedPageBreak/>
-        <w:t>M61, piano lh, beat 3, bottom Bb is clashing and disappearing into note head.</w:t>
+        <w:t xml:space="preserve">M61, piano </w:t>
+      </w:r>
+      <w:proofErr w:type="spellStart"/>
+      <w:r>
+        <w:t>lh</w:t>
+      </w:r>
+      <w:proofErr w:type="spellEnd"/>
+      <w:r>
+        <w:t>, beat 3, bottom Bb is clashing and disappearing into note head.</w:t>
       </w:r>
     </w:p>
     <w:p>
@@ -6786,7 +7005,15 @@
         </w:numPr>
       </w:pPr>
       <w:r>
-        <w:t>M66, ob, sax, please add beam even though start with rest to show the beat better</w:t>
+        <w:t xml:space="preserve">M66, </w:t>
+      </w:r>
+      <w:proofErr w:type="spellStart"/>
+      <w:r>
+        <w:t>ob</w:t>
+      </w:r>
+      <w:proofErr w:type="spellEnd"/>
+      <w:r>
+        <w:t>, sax, please add beam even though start with rest to show the beat better</w:t>
       </w:r>
     </w:p>
     <w:p>
@@ -6807,7 +7034,15 @@
         </w:numPr>
       </w:pPr>
       <w:r>
-        <w:t>M66, ob and flute, clarinet, fix size of the font for accidental</w:t>
+        <w:t xml:space="preserve">M66, </w:t>
+      </w:r>
+      <w:proofErr w:type="spellStart"/>
+      <w:r>
+        <w:t>ob</w:t>
+      </w:r>
+      <w:proofErr w:type="spellEnd"/>
+      <w:r>
+        <w:t xml:space="preserve"> and flute, clarinet, fix size of the font for accidental</w:t>
       </w:r>
     </w:p>
     <w:p>
@@ -6828,7 +7063,15 @@
         </w:numPr>
       </w:pPr>
       <w:r>
-        <w:t>M67, fute and sax, fix size of the font for accidental</w:t>
+        <w:t xml:space="preserve">M67, </w:t>
+      </w:r>
+      <w:proofErr w:type="spellStart"/>
+      <w:r>
+        <w:t>fute</w:t>
+      </w:r>
+      <w:proofErr w:type="spellEnd"/>
+      <w:r>
+        <w:t xml:space="preserve"> and sax, fix size of the font for accidental</w:t>
       </w:r>
     </w:p>
     <w:p>
@@ -6995,7 +7238,23 @@
         </w:numPr>
       </w:pPr>
       <w:r>
-        <w:t>M87, fl, ob, harp, please add beam even though start with rest to show the beat better</w:t>
+        <w:t xml:space="preserve">M87, </w:t>
+      </w:r>
+      <w:proofErr w:type="spellStart"/>
+      <w:r>
+        <w:t>fl</w:t>
+      </w:r>
+      <w:proofErr w:type="spellEnd"/>
+      <w:r>
+        <w:t xml:space="preserve">, </w:t>
+      </w:r>
+      <w:proofErr w:type="spellStart"/>
+      <w:r>
+        <w:t>ob</w:t>
+      </w:r>
+      <w:proofErr w:type="spellEnd"/>
+      <w:r>
+        <w:t>, harp, please add beam even though start with rest to show the beat better</w:t>
       </w:r>
       <w:r>
         <w:br/>
@@ -7077,7 +7336,15 @@
         </w:numPr>
       </w:pPr>
       <w:r>
-        <w:t>M96, vla, beat 1 please add beam even though start with rest to show the beat better</w:t>
+        <w:t xml:space="preserve">M96, </w:t>
+      </w:r>
+      <w:proofErr w:type="spellStart"/>
+      <w:r>
+        <w:t>vla</w:t>
+      </w:r>
+      <w:proofErr w:type="spellEnd"/>
+      <w:r>
+        <w:t>, beat 1 please add beam even though start with rest to show the beat better</w:t>
       </w:r>
       <w:r>
         <w:br/>
@@ -7092,7 +7359,15 @@
         </w:numPr>
       </w:pPr>
       <w:r>
-        <w:t>M98, vla, please add beam even though start with rest to show the beat better</w:t>
+        <w:t xml:space="preserve">M98, </w:t>
+      </w:r>
+      <w:proofErr w:type="spellStart"/>
+      <w:r>
+        <w:t>vla</w:t>
+      </w:r>
+      <w:proofErr w:type="spellEnd"/>
+      <w:r>
+        <w:t>, please add beam even though start with rest to show the beat better</w:t>
       </w:r>
     </w:p>
     <w:p>
@@ -7134,8 +7409,13 @@
         </w:numPr>
       </w:pPr>
       <w:r>
-        <w:t>AFTER 102, TUTTI, Missing double barline</w:t>
-      </w:r>
+        <w:t xml:space="preserve">AFTER 102, TUTTI, Missing double </w:t>
+      </w:r>
+      <w:proofErr w:type="spellStart"/>
+      <w:r>
+        <w:t>barline</w:t>
+      </w:r>
+      <w:proofErr w:type="spellEnd"/>
     </w:p>
     <w:p>
       <w:pPr>
@@ -7170,7 +7450,15 @@
         </w:numPr>
       </w:pPr>
       <w:r>
-        <w:t>M105, marimba, make gliss arrows look better, longer, parallel, closer to touching the (deleted) noteheads</w:t>
+        <w:t xml:space="preserve">M105, marimba, make </w:t>
+      </w:r>
+      <w:proofErr w:type="spellStart"/>
+      <w:r>
+        <w:t>gliss</w:t>
+      </w:r>
+      <w:proofErr w:type="spellEnd"/>
+      <w:r>
+        <w:t xml:space="preserve"> arrows look better, longer, parallel, closer to touching the (deleted) noteheads</w:t>
       </w:r>
     </w:p>
     <w:p>
@@ -7210,7 +7498,15 @@
         </w:numPr>
       </w:pPr>
       <w:r>
-        <w:t>M108, marimba, make gliss arrows look better, longer, parallel, closer to touching the (deleted) noteheads</w:t>
+        <w:t xml:space="preserve">M108, marimba, make </w:t>
+      </w:r>
+      <w:proofErr w:type="spellStart"/>
+      <w:r>
+        <w:t>gliss</w:t>
+      </w:r>
+      <w:proofErr w:type="spellEnd"/>
+      <w:r>
+        <w:t xml:space="preserve"> arrows look better, longer, parallel, closer to touching the (deleted) noteheads</w:t>
       </w:r>
     </w:p>
     <w:p>
@@ -7279,7 +7575,15 @@
         <w:t>1</w:t>
       </w:r>
       <w:r>
-        <w:t>1, marimba, marimba, make gliss arrows look better, longer, parallel, closer to touching the (deleted) noteheads</w:t>
+        <w:t xml:space="preserve">1, marimba, marimba, make </w:t>
+      </w:r>
+      <w:proofErr w:type="spellStart"/>
+      <w:r>
+        <w:t>gliss</w:t>
+      </w:r>
+      <w:proofErr w:type="spellEnd"/>
+      <w:r>
+        <w:t xml:space="preserve"> arrows look better, longer, parallel, closer to touching the (deleted) noteheads</w:t>
       </w:r>
     </w:p>
     <w:p>
@@ -7359,7 +7663,23 @@
         </w:numPr>
       </w:pPr>
       <w:r>
-        <w:t>M120, fl, ob, cl, beat 2, please add beam even though start with rest to show the beat better</w:t>
+        <w:t xml:space="preserve">M120, </w:t>
+      </w:r>
+      <w:proofErr w:type="spellStart"/>
+      <w:r>
+        <w:t>fl</w:t>
+      </w:r>
+      <w:proofErr w:type="spellEnd"/>
+      <w:r>
+        <w:t xml:space="preserve">, </w:t>
+      </w:r>
+      <w:proofErr w:type="spellStart"/>
+      <w:r>
+        <w:t>ob</w:t>
+      </w:r>
+      <w:proofErr w:type="spellEnd"/>
+      <w:r>
+        <w:t>, cl, beat 2, please add beam even though start with rest to show the beat better</w:t>
       </w:r>
     </w:p>
     <w:p>
@@ -7464,7 +7784,15 @@
         </w:numPr>
       </w:pPr>
       <w:r>
-        <w:t>M127, sax, perc 2, pf, hp, vl1 and 2, cello; beat 4, please add beam even though start with rest to show the beat better…also subdivide vla beat 4 into 2 tied eight notes (as score)</w:t>
+        <w:t xml:space="preserve">M127, sax, perc 2, pf, hp, vl1 and 2, cello; beat 4, please add beam even though start with rest to show the beat better…also subdivide </w:t>
+      </w:r>
+      <w:proofErr w:type="spellStart"/>
+      <w:r>
+        <w:t>vla</w:t>
+      </w:r>
+      <w:proofErr w:type="spellEnd"/>
+      <w:r>
+        <w:t xml:space="preserve"> beat 4 into 2 tied eight notes (as score)</w:t>
       </w:r>
     </w:p>
     <w:p>
@@ -7485,7 +7813,15 @@
         </w:numPr>
       </w:pPr>
       <w:r>
-        <w:t>M128, piano, right hand, notes should ve high G and A (not E, F)</w:t>
+        <w:t xml:space="preserve">M128, piano, right hand, notes should </w:t>
+      </w:r>
+      <w:proofErr w:type="spellStart"/>
+      <w:r>
+        <w:t>ve</w:t>
+      </w:r>
+      <w:proofErr w:type="spellEnd"/>
+      <w:r>
+        <w:t xml:space="preserve"> high G and A (not E, F)</w:t>
       </w:r>
     </w:p>
     <w:p>
@@ -7506,7 +7842,15 @@
         </w:numPr>
       </w:pPr>
       <w:r>
-        <w:t>M130, tutti (except for vla and perc), please add beam even though start with rest to show the beat better</w:t>
+        <w:t xml:space="preserve">M130, tutti (except for </w:t>
+      </w:r>
+      <w:proofErr w:type="spellStart"/>
+      <w:r>
+        <w:t>vla</w:t>
+      </w:r>
+      <w:proofErr w:type="spellEnd"/>
+      <w:r>
+        <w:t xml:space="preserve"> and perc), please add beam even though start with rest to show the beat better</w:t>
       </w:r>
     </w:p>
     <w:p>
@@ -7527,7 +7871,15 @@
         </w:numPr>
       </w:pPr>
       <w:r>
-        <w:t>M131, cello, wrong note, should be D nat (not B)</w:t>
+        <w:t xml:space="preserve">M131, cello, wrong note, should be D </w:t>
+      </w:r>
+      <w:proofErr w:type="spellStart"/>
+      <w:r>
+        <w:t>nat</w:t>
+      </w:r>
+      <w:proofErr w:type="spellEnd"/>
+      <w:r>
+        <w:t xml:space="preserve"> (not B)</w:t>
       </w:r>
     </w:p>
     <w:p>
@@ -7548,7 +7900,15 @@
         </w:numPr>
       </w:pPr>
       <w:r>
-        <w:t>M132, tutti (except for vla and perc), please add beam even though start with rest to show the beat better</w:t>
+        <w:t xml:space="preserve">M132, tutti (except for </w:t>
+      </w:r>
+      <w:proofErr w:type="spellStart"/>
+      <w:r>
+        <w:t>vla</w:t>
+      </w:r>
+      <w:proofErr w:type="spellEnd"/>
+      <w:r>
+        <w:t xml:space="preserve"> and perc), please add beam even though start with rest to show the beat better</w:t>
       </w:r>
     </w:p>
     <w:p>
@@ -7648,7 +8008,15 @@
         </w:rPr>
       </w:pPr>
       <w:r>
-        <w:t>M138, tutti except winds and perc 1; M130, tutti (except for vla and perc), please add beam even though start with rest to show the beat better</w:t>
+        <w:t xml:space="preserve">M138, tutti except winds and perc 1; M130, tutti (except for </w:t>
+      </w:r>
+      <w:proofErr w:type="spellStart"/>
+      <w:r>
+        <w:t>vla</w:t>
+      </w:r>
+      <w:proofErr w:type="spellEnd"/>
+      <w:r>
+        <w:t xml:space="preserve"> and perc), please add beam even though start with rest to show the beat better</w:t>
       </w:r>
       <w:r>
         <w:rPr>
@@ -7667,7 +8035,15 @@
         </w:numPr>
       </w:pPr>
       <w:r>
-        <w:t>M143, ob, add natural to first note</w:t>
+        <w:t xml:space="preserve">M143, </w:t>
+      </w:r>
+      <w:proofErr w:type="spellStart"/>
+      <w:r>
+        <w:t>ob</w:t>
+      </w:r>
+      <w:proofErr w:type="spellEnd"/>
+      <w:r>
+        <w:t>, add natural to first note</w:t>
       </w:r>
     </w:p>
     <w:p>
@@ -7787,42 +8163,60 @@
     <w:p>
       <w:pPr>
         <w:rPr>
+          <w:rFonts w:ascii="Times New Roman" w:eastAsia="Times New Roman" w:hAnsi="Times New Roman" w:cs="Times New Roman"/>
+          <w:lang w:val="en-US" w:eastAsia="en-US"/>
+        </w:rPr>
+      </w:pPr>
+    </w:p>
+    <w:p>
+      <w:pPr>
+        <w:rPr>
           <w:rFonts w:ascii="Times" w:eastAsia="Times" w:hAnsi="Times" w:cs="Times"/>
           <w:b/>
           <w:bCs/>
         </w:rPr>
       </w:pPr>
-    </w:p>
-    <w:p>
-      <w:pPr>
+      <w:r>
         <w:rPr>
           <w:rFonts w:ascii="Times" w:eastAsia="Times" w:hAnsi="Times" w:cs="Times"/>
           <w:b/>
           <w:bCs/>
         </w:rPr>
-      </w:pPr>
-    </w:p>
-    <w:p>
-      <w:pPr>
+        <w:lastRenderedPageBreak/>
+        <w:t>Further edits</w:t>
+      </w:r>
+      <w:r>
         <w:rPr>
           <w:rFonts w:ascii="Times" w:eastAsia="Times" w:hAnsi="Times" w:cs="Times"/>
-        </w:rPr>
-      </w:pPr>
+          <w:b/>
+          <w:bCs/>
+        </w:rPr>
+        <w:t xml:space="preserve"> </w:t>
+      </w:r>
       <w:r>
         <w:rPr>
           <w:rFonts w:ascii="Times" w:eastAsia="Times" w:hAnsi="Times" w:cs="Times"/>
         </w:rPr>
-        <w:t>Further notes</w:t>
-      </w:r>
+        <w:t>(5 Mar 2024)</w:t>
+      </w:r>
+    </w:p>
+    <w:p>
+      <w:pPr>
+        <w:rPr>
+          <w:rFonts w:ascii="Times" w:eastAsia="Times" w:hAnsi="Times" w:cs="Times"/>
+          <w:b/>
+          <w:bCs/>
+        </w:rPr>
+      </w:pPr>
     </w:p>
     <w:p>
       <w:pPr>
         <w:numPr>
           <w:ilvl w:val="0"/>
-          <w:numId w:val="7"/>
+          <w:numId w:val="14"/>
         </w:numPr>
         <w:shd w:val="clear" w:color="auto" w:fill="FFFFFF"/>
-        <w:spacing w:before="100" w:beforeAutospacing="1" w:after="240"/>
+        <w:spacing w:line="360" w:lineRule="auto"/>
         <w:ind w:left="945"/>
         <w:rPr>
           <w:rFonts w:eastAsia="Times New Roman"/>
@@ -7836,141 +8230,233 @@
           <w:color w:val="000000"/>
           <w:lang w:val="en-US" w:eastAsia="en-US"/>
         </w:rPr>
-        <w:t>M5 and 6, Vl2 missing crescendo</w:t>
-      </w:r>
-    </w:p>
-    <w:p>
-      <w:pPr>
-        <w:numPr>
-          <w:ilvl w:val="0"/>
-          <w:numId w:val="7"/>
-        </w:numPr>
-        <w:shd w:val="clear" w:color="auto" w:fill="FFFFFF"/>
-        <w:spacing w:before="100" w:beforeAutospacing="1" w:after="240"/>
-        <w:ind w:left="945"/>
+        <w:t xml:space="preserve">M5 and 6, Vl2 missing </w:t>
+      </w:r>
+      <w:proofErr w:type="gramStart"/>
+      <w:r>
         <w:rPr>
           <w:rFonts w:eastAsia="Times New Roman"/>
           <w:color w:val="000000"/>
           <w:lang w:val="en-US" w:eastAsia="en-US"/>
         </w:rPr>
-      </w:pPr>
-      <w:r>
+        <w:t>crescendo</w:t>
+      </w:r>
+      <w:proofErr w:type="gramEnd"/>
+    </w:p>
+    <w:p>
+      <w:pPr>
+        <w:numPr>
+          <w:ilvl w:val="0"/>
+          <w:numId w:val="14"/>
+        </w:numPr>
+        <w:shd w:val="clear" w:color="auto" w:fill="FFFFFF"/>
+        <w:spacing w:line="360" w:lineRule="auto"/>
+        <w:ind w:left="945"/>
         <w:rPr>
           <w:rFonts w:eastAsia="Times New Roman"/>
           <w:color w:val="000000"/>
           <w:lang w:val="en-US" w:eastAsia="en-US"/>
         </w:rPr>
-        <w:t xml:space="preserve">M37, cl, beat 3, please add beam; </w:t>
-      </w:r>
-      <w:proofErr w:type="gramStart"/>
+      </w:pPr>
       <w:r>
         <w:rPr>
           <w:rFonts w:eastAsia="Times New Roman"/>
           <w:color w:val="000000"/>
           <w:lang w:val="en-US" w:eastAsia="en-US"/>
         </w:rPr>
-        <w:t>Also</w:t>
-      </w:r>
-      <w:proofErr w:type="gramEnd"/>
+        <w:t xml:space="preserve">M37, cl, beat 3, please add beam; </w:t>
+      </w:r>
+      <w:proofErr w:type="gramStart"/>
       <w:r>
         <w:rPr>
           <w:rFonts w:eastAsia="Times New Roman"/>
           <w:color w:val="000000"/>
           <w:lang w:val="en-US" w:eastAsia="en-US"/>
         </w:rPr>
-        <w:t xml:space="preserve"> FL beat 2</w:t>
-      </w:r>
-    </w:p>
-    <w:p>
-      <w:pPr>
-        <w:numPr>
-          <w:ilvl w:val="0"/>
-          <w:numId w:val="7"/>
-        </w:numPr>
-        <w:shd w:val="clear" w:color="auto" w:fill="FFFFFF"/>
-        <w:spacing w:before="100" w:beforeAutospacing="1" w:after="240"/>
-        <w:ind w:left="945"/>
+        <w:t>Also</w:t>
+      </w:r>
+      <w:proofErr w:type="gramEnd"/>
+      <w:r>
         <w:rPr>
           <w:rFonts w:eastAsia="Times New Roman"/>
           <w:color w:val="000000"/>
           <w:lang w:val="en-US" w:eastAsia="en-US"/>
         </w:rPr>
-      </w:pPr>
-      <w:r>
+        <w:t xml:space="preserve"> FL beat 2</w:t>
+      </w:r>
+    </w:p>
+    <w:p>
+      <w:pPr>
+        <w:numPr>
+          <w:ilvl w:val="0"/>
+          <w:numId w:val="14"/>
+        </w:numPr>
+        <w:shd w:val="clear" w:color="auto" w:fill="FFFFFF"/>
+        <w:spacing w:line="360" w:lineRule="auto"/>
+        <w:ind w:left="945"/>
         <w:rPr>
           <w:rFonts w:eastAsia="Times New Roman"/>
           <w:color w:val="000000"/>
           <w:lang w:val="en-US" w:eastAsia="en-US"/>
         </w:rPr>
-        <w:t>M44, vl2, delete upbow sign mid tie</w:t>
-      </w:r>
-    </w:p>
-    <w:p>
-      <w:pPr>
-        <w:numPr>
-          <w:ilvl w:val="0"/>
-          <w:numId w:val="7"/>
-        </w:numPr>
-        <w:shd w:val="clear" w:color="auto" w:fill="FFFFFF"/>
-        <w:spacing w:before="100" w:beforeAutospacing="1" w:after="100" w:afterAutospacing="1"/>
-        <w:ind w:left="945"/>
+      </w:pPr>
+      <w:r>
         <w:rPr>
           <w:rFonts w:eastAsia="Times New Roman"/>
           <w:color w:val="000000"/>
           <w:lang w:val="en-US" w:eastAsia="en-US"/>
         </w:rPr>
-      </w:pPr>
+        <w:t xml:space="preserve">M40, hp, pf, perc 2, </w:t>
+      </w:r>
+      <w:proofErr w:type="spellStart"/>
       <w:r>
         <w:rPr>
           <w:rFonts w:eastAsia="Times New Roman"/>
           <w:color w:val="000000"/>
           <w:lang w:val="en-US" w:eastAsia="en-US"/>
         </w:rPr>
-        <w:t>M40, hp, pf, perc 2, sl, ob, fl; beat 4 add beams to rest </w:t>
-      </w:r>
-    </w:p>
-    <w:p>
-      <w:pPr>
-        <w:shd w:val="clear" w:color="auto" w:fill="FFFFFF"/>
+        <w:t>sl</w:t>
+      </w:r>
+      <w:proofErr w:type="spellEnd"/>
+      <w:r>
         <w:rPr>
           <w:rFonts w:eastAsia="Times New Roman"/>
           <w:color w:val="000000"/>
           <w:lang w:val="en-US" w:eastAsia="en-US"/>
         </w:rPr>
-      </w:pPr>
-    </w:p>
-    <w:p>
-      <w:pPr>
-        <w:numPr>
-          <w:ilvl w:val="0"/>
-          <w:numId w:val="8"/>
-        </w:numPr>
-        <w:shd w:val="clear" w:color="auto" w:fill="FFFFFF"/>
-        <w:spacing w:before="100" w:beforeAutospacing="1" w:after="240"/>
-        <w:ind w:left="945"/>
+        <w:t xml:space="preserve">, </w:t>
+      </w:r>
+      <w:proofErr w:type="spellStart"/>
+      <w:r>
         <w:rPr>
           <w:rFonts w:eastAsia="Times New Roman"/>
           <w:color w:val="000000"/>
           <w:lang w:val="en-US" w:eastAsia="en-US"/>
         </w:rPr>
-      </w:pPr>
+        <w:t>ob</w:t>
+      </w:r>
+      <w:proofErr w:type="spellEnd"/>
       <w:r>
         <w:rPr>
           <w:rFonts w:eastAsia="Times New Roman"/>
           <w:color w:val="000000"/>
           <w:lang w:val="en-US" w:eastAsia="en-US"/>
         </w:rPr>
-        <w:t>M50, perc 1, beat 4, add beam to triplet with rests</w:t>
+        <w:t xml:space="preserve">, </w:t>
+      </w:r>
+      <w:proofErr w:type="spellStart"/>
+      <w:r>
+        <w:rPr>
+          <w:rFonts w:eastAsia="Times New Roman"/>
+          <w:color w:val="000000"/>
+          <w:lang w:val="en-US" w:eastAsia="en-US"/>
+        </w:rPr>
+        <w:t>fl</w:t>
+      </w:r>
+      <w:proofErr w:type="spellEnd"/>
+      <w:r>
+        <w:rPr>
+          <w:rFonts w:eastAsia="Times New Roman"/>
+          <w:color w:val="000000"/>
+          <w:lang w:val="en-US" w:eastAsia="en-US"/>
+        </w:rPr>
+        <w:t xml:space="preserve">; beat 4 add beams to </w:t>
+      </w:r>
+      <w:proofErr w:type="gramStart"/>
+      <w:r>
+        <w:rPr>
+          <w:rFonts w:eastAsia="Times New Roman"/>
+          <w:color w:val="000000"/>
+          <w:lang w:val="en-US" w:eastAsia="en-US"/>
+        </w:rPr>
+        <w:t>rest</w:t>
+      </w:r>
+      <w:proofErr w:type="gramEnd"/>
+      <w:r>
+        <w:rPr>
+          <w:rFonts w:eastAsia="Times New Roman"/>
+          <w:color w:val="000000"/>
+          <w:lang w:val="en-US" w:eastAsia="en-US"/>
+        </w:rPr>
+        <w:t> </w:t>
       </w:r>
     </w:p>
     <w:p>
       <w:pPr>
         <w:numPr>
           <w:ilvl w:val="0"/>
-          <w:numId w:val="8"/>
+          <w:numId w:val="14"/>
         </w:numPr>
         <w:shd w:val="clear" w:color="auto" w:fill="FFFFFF"/>
-        <w:spacing w:before="100" w:beforeAutospacing="1" w:after="100" w:afterAutospacing="1"/>
+        <w:spacing w:line="360" w:lineRule="auto"/>
+        <w:ind w:left="945"/>
+        <w:rPr>
+          <w:rFonts w:eastAsia="Times New Roman"/>
+          <w:color w:val="000000"/>
+          <w:lang w:val="en-US" w:eastAsia="en-US"/>
+        </w:rPr>
+      </w:pPr>
+      <w:r>
+        <w:rPr>
+          <w:rFonts w:eastAsia="Times New Roman"/>
+          <w:color w:val="000000"/>
+          <w:lang w:val="en-US" w:eastAsia="en-US"/>
+        </w:rPr>
+        <w:t xml:space="preserve">M44, vl2, delete upbow sign mid </w:t>
+      </w:r>
+      <w:proofErr w:type="gramStart"/>
+      <w:r>
+        <w:rPr>
+          <w:rFonts w:eastAsia="Times New Roman"/>
+          <w:color w:val="000000"/>
+          <w:lang w:val="en-US" w:eastAsia="en-US"/>
+        </w:rPr>
+        <w:t>tie</w:t>
+      </w:r>
+      <w:proofErr w:type="gramEnd"/>
+    </w:p>
+    <w:p>
+      <w:pPr>
+        <w:numPr>
+          <w:ilvl w:val="0"/>
+          <w:numId w:val="15"/>
+        </w:numPr>
+        <w:shd w:val="clear" w:color="auto" w:fill="FFFFFF"/>
+        <w:spacing w:line="360" w:lineRule="auto"/>
+        <w:ind w:left="945"/>
+        <w:rPr>
+          <w:rFonts w:eastAsia="Times New Roman"/>
+          <w:color w:val="000000"/>
+          <w:lang w:val="en-US" w:eastAsia="en-US"/>
+        </w:rPr>
+      </w:pPr>
+      <w:r>
+        <w:rPr>
+          <w:rFonts w:eastAsia="Times New Roman"/>
+          <w:color w:val="000000"/>
+          <w:lang w:val="en-US" w:eastAsia="en-US"/>
+        </w:rPr>
+        <w:t xml:space="preserve">M50, perc 1, beat 4, add beam to triplet with </w:t>
+      </w:r>
+      <w:proofErr w:type="gramStart"/>
+      <w:r>
+        <w:rPr>
+          <w:rFonts w:eastAsia="Times New Roman"/>
+          <w:color w:val="000000"/>
+          <w:lang w:val="en-US" w:eastAsia="en-US"/>
+        </w:rPr>
+        <w:t>rests</w:t>
+      </w:r>
+      <w:proofErr w:type="gramEnd"/>
+    </w:p>
+    <w:p>
+      <w:pPr>
+        <w:numPr>
+          <w:ilvl w:val="0"/>
+          <w:numId w:val="15"/>
+        </w:numPr>
+        <w:shd w:val="clear" w:color="auto" w:fill="FFFFFF"/>
+        <w:spacing w:line="360" w:lineRule="auto"/>
         <w:ind w:left="945"/>
         <w:rPr>
           <w:rFonts w:eastAsia="Times New Roman"/>
@@ -8001,29 +8487,27 @@
           <w:color w:val="000000"/>
           <w:lang w:val="en-US" w:eastAsia="en-US"/>
         </w:rPr>
-        <w:t> in the entire bar</w:t>
-      </w:r>
-    </w:p>
-    <w:p>
-      <w:pPr>
-        <w:shd w:val="clear" w:color="auto" w:fill="FFFFFF"/>
-        <w:spacing w:before="100" w:beforeAutospacing="1" w:after="100" w:afterAutospacing="1"/>
-        <w:ind w:left="945"/>
+        <w:t xml:space="preserve"> in the entire </w:t>
+      </w:r>
+      <w:proofErr w:type="gramStart"/>
+      <w:r>
         <w:rPr>
           <w:rFonts w:eastAsia="Times New Roman"/>
           <w:color w:val="000000"/>
           <w:lang w:val="en-US" w:eastAsia="en-US"/>
         </w:rPr>
-      </w:pPr>
+        <w:t>bar</w:t>
+      </w:r>
+      <w:proofErr w:type="gramEnd"/>
     </w:p>
     <w:p>
       <w:pPr>
         <w:numPr>
           <w:ilvl w:val="0"/>
-          <w:numId w:val="8"/>
+          <w:numId w:val="15"/>
         </w:numPr>
         <w:shd w:val="clear" w:color="auto" w:fill="FFFFFF"/>
-        <w:spacing w:before="100" w:beforeAutospacing="1" w:after="100" w:afterAutospacing="1"/>
+        <w:spacing w:line="360" w:lineRule="auto"/>
         <w:ind w:left="945"/>
         <w:rPr>
           <w:rFonts w:eastAsia="Times New Roman"/>
@@ -8046,42 +8530,9 @@
           <w:shd w:val="clear" w:color="auto" w:fill="FFFFFF"/>
           <w:lang w:val="en-US" w:eastAsia="en-US"/>
         </w:rPr>
-        <w:t>perc 1 and 2; add beam to triplet with rests in beat 1</w:t>
-      </w:r>
-    </w:p>
-    <w:p>
-      <w:pPr>
-        <w:shd w:val="clear" w:color="auto" w:fill="FFFFFF"/>
-        <w:rPr>
-          <w:rFonts w:eastAsia="Times New Roman"/>
-          <w:color w:val="000000"/>
-          <w:lang w:val="en-US" w:eastAsia="en-US"/>
-        </w:rPr>
-      </w:pPr>
-    </w:p>
-    <w:p>
-      <w:pPr>
-        <w:numPr>
-          <w:ilvl w:val="0"/>
-          <w:numId w:val="9"/>
-        </w:numPr>
-        <w:shd w:val="clear" w:color="auto" w:fill="FFFFFF"/>
-        <w:spacing w:before="100" w:beforeAutospacing="1" w:after="100" w:afterAutospacing="1"/>
-        <w:ind w:left="945"/>
-        <w:rPr>
-          <w:rFonts w:eastAsia="Times New Roman"/>
-          <w:color w:val="000000"/>
-          <w:lang w:val="en-US" w:eastAsia="en-US"/>
-        </w:rPr>
-      </w:pPr>
-      <w:r>
-        <w:rPr>
-          <w:rFonts w:eastAsia="Times New Roman"/>
-          <w:color w:val="000000"/>
-          <w:lang w:val="en-US" w:eastAsia="en-US"/>
-        </w:rPr>
-        <w:t>M91 and 93, piano, </w:t>
-      </w:r>
+        <w:t xml:space="preserve">perc 1 and 2; add beam to triplet with rests in beat </w:t>
+      </w:r>
+      <w:proofErr w:type="gramStart"/>
       <w:r>
         <w:rPr>
           <w:rFonts w:eastAsia="Times New Roman"/>
@@ -8089,51 +8540,32 @@
           <w:shd w:val="clear" w:color="auto" w:fill="FFFFFF"/>
           <w:lang w:val="en-US" w:eastAsia="en-US"/>
         </w:rPr>
-        <w:t>add beam to </w:t>
-      </w:r>
-      <w:r>
+        <w:t>1</w:t>
+      </w:r>
+      <w:proofErr w:type="gramEnd"/>
+    </w:p>
+    <w:p>
+      <w:pPr>
+        <w:numPr>
+          <w:ilvl w:val="0"/>
+          <w:numId w:val="16"/>
+        </w:numPr>
+        <w:shd w:val="clear" w:color="auto" w:fill="FFFFFF"/>
+        <w:spacing w:line="360" w:lineRule="auto"/>
+        <w:ind w:left="945"/>
         <w:rPr>
           <w:rFonts w:eastAsia="Times New Roman"/>
           <w:color w:val="000000"/>
           <w:lang w:val="en-US" w:eastAsia="en-US"/>
         </w:rPr>
-        <w:t>quintuplets</w:t>
-      </w:r>
-    </w:p>
-    <w:p>
-      <w:pPr>
-        <w:shd w:val="clear" w:color="auto" w:fill="FFFFFF"/>
-        <w:spacing w:before="100" w:beforeAutospacing="1" w:after="100" w:afterAutospacing="1"/>
-        <w:ind w:left="945"/>
+      </w:pPr>
+      <w:r>
         <w:rPr>
           <w:rFonts w:eastAsia="Times New Roman"/>
           <w:color w:val="000000"/>
           <w:lang w:val="en-US" w:eastAsia="en-US"/>
         </w:rPr>
-      </w:pPr>
-    </w:p>
-    <w:p>
-      <w:pPr>
-        <w:numPr>
-          <w:ilvl w:val="0"/>
-          <w:numId w:val="9"/>
-        </w:numPr>
-        <w:shd w:val="clear" w:color="auto" w:fill="FFFFFF"/>
-        <w:spacing w:before="100" w:beforeAutospacing="1" w:after="100" w:afterAutospacing="1"/>
-        <w:ind w:left="945"/>
-        <w:rPr>
-          <w:rFonts w:eastAsia="Times New Roman"/>
-          <w:color w:val="000000"/>
-          <w:lang w:val="en-US" w:eastAsia="en-US"/>
-        </w:rPr>
-      </w:pPr>
-      <w:r>
-        <w:rPr>
-          <w:rFonts w:eastAsia="Times New Roman"/>
-          <w:color w:val="000000"/>
-          <w:lang w:val="en-US" w:eastAsia="en-US"/>
-        </w:rPr>
-        <w:t>M92, vl2, beat 4, </w:t>
+        <w:t>M91 and 93, piano, </w:t>
       </w:r>
       <w:r>
         <w:rPr>
@@ -8142,27 +8574,27 @@
           <w:shd w:val="clear" w:color="auto" w:fill="FFFFFF"/>
           <w:lang w:val="en-US" w:eastAsia="en-US"/>
         </w:rPr>
-        <w:t>add beam to rests</w:t>
-      </w:r>
-    </w:p>
-    <w:p>
-      <w:pPr>
-        <w:shd w:val="clear" w:color="auto" w:fill="FFFFFF"/>
+        <w:t>add beam to </w:t>
+      </w:r>
+      <w:proofErr w:type="gramStart"/>
+      <w:r>
         <w:rPr>
           <w:rFonts w:eastAsia="Times New Roman"/>
           <w:color w:val="000000"/>
           <w:lang w:val="en-US" w:eastAsia="en-US"/>
         </w:rPr>
-      </w:pPr>
+        <w:t>quintuplets</w:t>
+      </w:r>
+      <w:proofErr w:type="gramEnd"/>
     </w:p>
     <w:p>
       <w:pPr>
         <w:numPr>
           <w:ilvl w:val="0"/>
-          <w:numId w:val="10"/>
+          <w:numId w:val="16"/>
         </w:numPr>
         <w:shd w:val="clear" w:color="auto" w:fill="FFFFFF"/>
-        <w:spacing w:before="100" w:beforeAutospacing="1" w:after="100" w:afterAutospacing="1"/>
+        <w:spacing w:line="360" w:lineRule="auto"/>
         <w:ind w:left="945"/>
         <w:rPr>
           <w:rFonts w:eastAsia="Times New Roman"/>
@@ -8176,7 +8608,7 @@
           <w:color w:val="000000"/>
           <w:lang w:val="en-US" w:eastAsia="en-US"/>
         </w:rPr>
-        <w:t>M121, piano lh, beat 4, </w:t>
+        <w:t>M92, vl2, beat 4, </w:t>
       </w:r>
       <w:r>
         <w:rPr>
@@ -8185,42 +8617,9 @@
           <w:shd w:val="clear" w:color="auto" w:fill="FFFFFF"/>
           <w:lang w:val="en-US" w:eastAsia="en-US"/>
         </w:rPr>
-        <w:t>add beam to rest</w:t>
-      </w:r>
-    </w:p>
-    <w:p>
-      <w:pPr>
-        <w:shd w:val="clear" w:color="auto" w:fill="FFFFFF"/>
-        <w:rPr>
-          <w:rFonts w:eastAsia="Times New Roman"/>
-          <w:color w:val="000000"/>
-          <w:lang w:val="en-US" w:eastAsia="en-US"/>
-        </w:rPr>
-      </w:pPr>
-    </w:p>
-    <w:p>
-      <w:pPr>
-        <w:numPr>
-          <w:ilvl w:val="0"/>
-          <w:numId w:val="11"/>
-        </w:numPr>
-        <w:shd w:val="clear" w:color="auto" w:fill="FFFFFF"/>
-        <w:spacing w:before="100" w:beforeAutospacing="1" w:after="100" w:afterAutospacing="1"/>
-        <w:ind w:left="945"/>
-        <w:rPr>
-          <w:rFonts w:eastAsia="Times New Roman"/>
-          <w:color w:val="000000"/>
-          <w:lang w:val="en-US" w:eastAsia="en-US"/>
-        </w:rPr>
-      </w:pPr>
-      <w:r>
-        <w:rPr>
-          <w:rFonts w:eastAsia="Times New Roman"/>
-          <w:color w:val="000000"/>
-          <w:lang w:val="en-US" w:eastAsia="en-US"/>
-        </w:rPr>
-        <w:t>M124, strings, </w:t>
-      </w:r>
+        <w:t xml:space="preserve">add beam to </w:t>
+      </w:r>
+      <w:proofErr w:type="gramStart"/>
       <w:r>
         <w:rPr>
           <w:rFonts w:eastAsia="Times New Roman"/>
@@ -8228,13 +8627,18 @@
           <w:shd w:val="clear" w:color="auto" w:fill="FFFFFF"/>
           <w:lang w:val="en-US" w:eastAsia="en-US"/>
         </w:rPr>
-        <w:t>add beam to rests</w:t>
-      </w:r>
-    </w:p>
-    <w:p>
-      <w:pPr>
+        <w:t>rests</w:t>
+      </w:r>
+      <w:proofErr w:type="gramEnd"/>
+    </w:p>
+    <w:p>
+      <w:pPr>
+        <w:numPr>
+          <w:ilvl w:val="0"/>
+          <w:numId w:val="17"/>
+        </w:numPr>
         <w:shd w:val="clear" w:color="auto" w:fill="FFFFFF"/>
-        <w:spacing w:before="100" w:beforeAutospacing="1" w:after="100" w:afterAutospacing="1"/>
+        <w:spacing w:line="360" w:lineRule="auto"/>
         <w:ind w:left="945"/>
         <w:rPr>
           <w:rFonts w:eastAsia="Times New Roman"/>
@@ -8242,29 +8646,31 @@
           <w:lang w:val="en-US" w:eastAsia="en-US"/>
         </w:rPr>
       </w:pPr>
-    </w:p>
-    <w:p>
-      <w:pPr>
-        <w:numPr>
-          <w:ilvl w:val="0"/>
-          <w:numId w:val="11"/>
-        </w:numPr>
-        <w:shd w:val="clear" w:color="auto" w:fill="FFFFFF"/>
-        <w:spacing w:before="100" w:beforeAutospacing="1" w:after="100" w:afterAutospacing="1"/>
-        <w:ind w:left="945"/>
+      <w:r>
         <w:rPr>
           <w:rFonts w:eastAsia="Times New Roman"/>
           <w:color w:val="000000"/>
           <w:lang w:val="en-US" w:eastAsia="en-US"/>
         </w:rPr>
-      </w:pPr>
+        <w:t xml:space="preserve">M121, piano </w:t>
+      </w:r>
+      <w:proofErr w:type="spellStart"/>
       <w:r>
         <w:rPr>
           <w:rFonts w:eastAsia="Times New Roman"/>
           <w:color w:val="000000"/>
           <w:lang w:val="en-US" w:eastAsia="en-US"/>
         </w:rPr>
-        <w:t>M138, vl1 and 2, cello, </w:t>
+        <w:t>lh</w:t>
+      </w:r>
+      <w:proofErr w:type="spellEnd"/>
+      <w:r>
+        <w:rPr>
+          <w:rFonts w:eastAsia="Times New Roman"/>
+          <w:color w:val="000000"/>
+          <w:lang w:val="en-US" w:eastAsia="en-US"/>
+        </w:rPr>
+        <w:t>, beat 4, </w:t>
       </w:r>
       <w:r>
         <w:rPr>
@@ -8273,42 +8679,9 @@
           <w:shd w:val="clear" w:color="auto" w:fill="FFFFFF"/>
           <w:lang w:val="en-US" w:eastAsia="en-US"/>
         </w:rPr>
-        <w:t>add beam to rests</w:t>
-      </w:r>
-    </w:p>
-    <w:p>
-      <w:pPr>
-        <w:shd w:val="clear" w:color="auto" w:fill="FFFFFF"/>
-        <w:rPr>
-          <w:rFonts w:ascii="Times New Roman" w:eastAsia="Times New Roman" w:hAnsi="Times New Roman" w:cs="Times New Roman"/>
-          <w:color w:val="222222"/>
-          <w:lang w:val="en-US" w:eastAsia="en-US"/>
-        </w:rPr>
-      </w:pPr>
-    </w:p>
-    <w:p>
-      <w:pPr>
-        <w:numPr>
-          <w:ilvl w:val="0"/>
-          <w:numId w:val="12"/>
-        </w:numPr>
-        <w:shd w:val="clear" w:color="auto" w:fill="FFFFFF"/>
-        <w:spacing w:before="100" w:beforeAutospacing="1" w:after="100" w:afterAutospacing="1"/>
-        <w:ind w:left="945"/>
-        <w:rPr>
-          <w:rFonts w:eastAsia="Times New Roman"/>
-          <w:color w:val="000000"/>
-          <w:lang w:val="en-US" w:eastAsia="en-US"/>
-        </w:rPr>
-      </w:pPr>
-      <w:r>
-        <w:rPr>
-          <w:rFonts w:eastAsia="Times New Roman"/>
-          <w:color w:val="000000"/>
-          <w:lang w:val="en-US" w:eastAsia="en-US"/>
-        </w:rPr>
-        <w:t>M140, perc 2, </w:t>
-      </w:r>
+        <w:t xml:space="preserve">add beam to </w:t>
+      </w:r>
+      <w:proofErr w:type="gramStart"/>
       <w:r>
         <w:rPr>
           <w:rFonts w:eastAsia="Times New Roman"/>
@@ -8316,27 +8689,18 @@
           <w:shd w:val="clear" w:color="auto" w:fill="FFFFFF"/>
           <w:lang w:val="en-US" w:eastAsia="en-US"/>
         </w:rPr>
-        <w:t>add beam to rest</w:t>
-      </w:r>
-    </w:p>
-    <w:p>
-      <w:pPr>
-        <w:shd w:val="clear" w:color="auto" w:fill="FFFFFF"/>
-        <w:rPr>
-          <w:rFonts w:ascii="Times New Roman" w:eastAsia="Times New Roman" w:hAnsi="Times New Roman" w:cs="Times New Roman"/>
-          <w:color w:val="222222"/>
-          <w:lang w:val="en-US" w:eastAsia="en-US"/>
-        </w:rPr>
-      </w:pPr>
+        <w:t>rest</w:t>
+      </w:r>
+      <w:proofErr w:type="gramEnd"/>
     </w:p>
     <w:p>
       <w:pPr>
         <w:numPr>
           <w:ilvl w:val="0"/>
-          <w:numId w:val="13"/>
+          <w:numId w:val="18"/>
         </w:numPr>
         <w:shd w:val="clear" w:color="auto" w:fill="FFFFFF"/>
-        <w:spacing w:before="100" w:beforeAutospacing="1" w:after="100" w:afterAutospacing="1"/>
+        <w:spacing w:line="360" w:lineRule="auto"/>
         <w:ind w:left="945"/>
         <w:rPr>
           <w:rFonts w:eastAsia="Times New Roman"/>
@@ -8350,7 +8714,7 @@
           <w:color w:val="000000"/>
           <w:lang w:val="en-US" w:eastAsia="en-US"/>
         </w:rPr>
-        <w:t>M151, piano lh, </w:t>
+        <w:t>M124, strings, </w:t>
       </w:r>
       <w:r>
         <w:rPr>
@@ -8359,14 +8723,164 @@
           <w:shd w:val="clear" w:color="auto" w:fill="FFFFFF"/>
           <w:lang w:val="en-US" w:eastAsia="en-US"/>
         </w:rPr>
-        <w:t>add beam to triplet with rests</w:t>
-      </w:r>
-      <w:r>
+        <w:t xml:space="preserve">add beam to </w:t>
+      </w:r>
+      <w:proofErr w:type="gramStart"/>
+      <w:r>
+        <w:rPr>
+          <w:rFonts w:eastAsia="Times New Roman"/>
+          <w:color w:val="000000"/>
+          <w:shd w:val="clear" w:color="auto" w:fill="FFFFFF"/>
+          <w:lang w:val="en-US" w:eastAsia="en-US"/>
+        </w:rPr>
+        <w:t>rests</w:t>
+      </w:r>
+      <w:proofErr w:type="gramEnd"/>
+    </w:p>
+    <w:p>
+      <w:pPr>
+        <w:numPr>
+          <w:ilvl w:val="0"/>
+          <w:numId w:val="18"/>
+        </w:numPr>
+        <w:shd w:val="clear" w:color="auto" w:fill="FFFFFF"/>
+        <w:spacing w:line="360" w:lineRule="auto"/>
+        <w:ind w:left="945"/>
         <w:rPr>
           <w:rFonts w:eastAsia="Times New Roman"/>
           <w:color w:val="000000"/>
           <w:lang w:val="en-US" w:eastAsia="en-US"/>
         </w:rPr>
+      </w:pPr>
+      <w:r>
+        <w:rPr>
+          <w:rFonts w:eastAsia="Times New Roman"/>
+          <w:color w:val="000000"/>
+          <w:lang w:val="en-US" w:eastAsia="en-US"/>
+        </w:rPr>
+        <w:t>M138, vl1 and 2, cello, </w:t>
+      </w:r>
+      <w:r>
+        <w:rPr>
+          <w:rFonts w:eastAsia="Times New Roman"/>
+          <w:color w:val="000000"/>
+          <w:shd w:val="clear" w:color="auto" w:fill="FFFFFF"/>
+          <w:lang w:val="en-US" w:eastAsia="en-US"/>
+        </w:rPr>
+        <w:t xml:space="preserve">add beam to </w:t>
+      </w:r>
+      <w:proofErr w:type="gramStart"/>
+      <w:r>
+        <w:rPr>
+          <w:rFonts w:eastAsia="Times New Roman"/>
+          <w:color w:val="000000"/>
+          <w:shd w:val="clear" w:color="auto" w:fill="FFFFFF"/>
+          <w:lang w:val="en-US" w:eastAsia="en-US"/>
+        </w:rPr>
+        <w:t>rests</w:t>
+      </w:r>
+      <w:proofErr w:type="gramEnd"/>
+    </w:p>
+    <w:p>
+      <w:pPr>
+        <w:numPr>
+          <w:ilvl w:val="0"/>
+          <w:numId w:val="19"/>
+        </w:numPr>
+        <w:shd w:val="clear" w:color="auto" w:fill="FFFFFF"/>
+        <w:spacing w:line="360" w:lineRule="auto"/>
+        <w:ind w:left="945"/>
+        <w:rPr>
+          <w:rFonts w:eastAsia="Times New Roman"/>
+          <w:color w:val="000000"/>
+          <w:lang w:val="en-US" w:eastAsia="en-US"/>
+        </w:rPr>
+      </w:pPr>
+      <w:r>
+        <w:rPr>
+          <w:rFonts w:eastAsia="Times New Roman"/>
+          <w:color w:val="000000"/>
+          <w:lang w:val="en-US" w:eastAsia="en-US"/>
+        </w:rPr>
+        <w:t>M140, perc 2, </w:t>
+      </w:r>
+      <w:r>
+        <w:rPr>
+          <w:rFonts w:eastAsia="Times New Roman"/>
+          <w:color w:val="000000"/>
+          <w:shd w:val="clear" w:color="auto" w:fill="FFFFFF"/>
+          <w:lang w:val="en-US" w:eastAsia="en-US"/>
+        </w:rPr>
+        <w:t xml:space="preserve">add beam to </w:t>
+      </w:r>
+      <w:proofErr w:type="gramStart"/>
+      <w:r>
+        <w:rPr>
+          <w:rFonts w:eastAsia="Times New Roman"/>
+          <w:color w:val="000000"/>
+          <w:shd w:val="clear" w:color="auto" w:fill="FFFFFF"/>
+          <w:lang w:val="en-US" w:eastAsia="en-US"/>
+        </w:rPr>
+        <w:t>rest</w:t>
+      </w:r>
+      <w:proofErr w:type="gramEnd"/>
+    </w:p>
+    <w:p>
+      <w:pPr>
+        <w:numPr>
+          <w:ilvl w:val="0"/>
+          <w:numId w:val="20"/>
+        </w:numPr>
+        <w:shd w:val="clear" w:color="auto" w:fill="FFFFFF"/>
+        <w:spacing w:line="360" w:lineRule="auto"/>
+        <w:ind w:left="945"/>
+        <w:rPr>
+          <w:rFonts w:eastAsia="Times New Roman"/>
+          <w:color w:val="000000"/>
+          <w:lang w:val="en-US" w:eastAsia="en-US"/>
+        </w:rPr>
+      </w:pPr>
+      <w:r>
+        <w:rPr>
+          <w:rFonts w:eastAsia="Times New Roman"/>
+          <w:color w:val="000000"/>
+          <w:lang w:val="en-US" w:eastAsia="en-US"/>
+        </w:rPr>
+        <w:t xml:space="preserve">M151, piano </w:t>
+      </w:r>
+      <w:proofErr w:type="spellStart"/>
+      <w:r>
+        <w:rPr>
+          <w:rFonts w:eastAsia="Times New Roman"/>
+          <w:color w:val="000000"/>
+          <w:lang w:val="en-US" w:eastAsia="en-US"/>
+        </w:rPr>
+        <w:t>lh</w:t>
+      </w:r>
+      <w:proofErr w:type="spellEnd"/>
+      <w:r>
+        <w:rPr>
+          <w:rFonts w:eastAsia="Times New Roman"/>
+          <w:color w:val="000000"/>
+          <w:lang w:val="en-US" w:eastAsia="en-US"/>
+        </w:rPr>
+        <w:t>, </w:t>
+      </w:r>
+      <w:r>
+        <w:rPr>
+          <w:rFonts w:eastAsia="Times New Roman"/>
+          <w:color w:val="000000"/>
+          <w:shd w:val="clear" w:color="auto" w:fill="FFFFFF"/>
+          <w:lang w:val="en-US" w:eastAsia="en-US"/>
+        </w:rPr>
+        <w:t>add beam to triplet with rests</w:t>
+      </w:r>
+      <w:r>
+        <w:rPr>
+          <w:rFonts w:eastAsia="Times New Roman"/>
+          <w:color w:val="000000"/>
+          <w:lang w:val="en-US" w:eastAsia="en-US"/>
+        </w:rPr>
         <w:t>...also add tied note to first note of the bar (looks better than a bunch of rests only</w:t>
       </w:r>
     </w:p>
@@ -8382,6 +8896,8 @@
       <w:pPr>
         <w:rPr>
           <w:rFonts w:ascii="Times" w:eastAsia="Times" w:hAnsi="Times" w:cs="Times"/>
+          <w:b/>
+          <w:bCs/>
         </w:rPr>
       </w:pPr>
     </w:p>
@@ -8436,6 +8952,155 @@
 <file path=word/numbering.xml><?xml version="1.0" encoding="utf-8"?>
 <w:numbering xmlns:wpc="http://schemas.microsoft.com/office/word/2010/wordprocessingCanvas" xmlns:cx="http://schemas.microsoft.com/office/drawing/2014/chartex" xmlns:cx1="http://schemas.microsoft.com/office/drawing/2015/9/8/chartex" xmlns:cx2="http://schemas.microsoft.com/office/drawing/2015/10/21/chartex" xmlns:cx3="http://schemas.microsoft.com/office/drawing/2016/5/9/chartex" xmlns:cx4="http://schemas.microsoft.com/office/drawing/2016/5/10/chartex" xmlns:cx5="http://schemas.microsoft.com/office/drawing/2016/5/11/chartex" xmlns:cx6="http://schemas.microsoft.com/office/drawing/2016/5/12/chartex" xmlns:cx7="http://schemas.microsoft.com/office/drawing/2016/5/13/chartex" xmlns:cx8="http://schemas.microsoft.com/office/drawing/2016/5/14/chartex" xmlns:mc="http://schemas.openxmlformats.org/markup-compatibility/2006" xmlns:aink="http://schemas.microsoft.com/office/drawing/2016/ink" xmlns:am3d="http://schemas.microsoft.com/office/drawing/2017/model3d" xmlns:o="urn:schemas-microsoft-com:office:office" xmlns:oel="http://schemas.microsoft.com/office/2019/extlst" xmlns:r="http://schemas.openxmlformats.org/officeDocument/2006/relationships" xmlns:m="http://schemas.openxmlformats.org/officeDocument/2006/math" xmlns:v="urn:schemas-microsoft-com:vml" xmlns:wp14="http://schemas.microsoft.com/office/word/2010/wordprocessingDrawing" xmlns:wp="http://schemas.openxmlformats.org/drawingml/2006/wordprocessingDrawing" xmlns:w10="urn:schemas-microsoft-com:office:word" xmlns:w="http://schemas.openxmlformats.org/wordprocessingml/2006/main" xmlns:w14="http://schemas.microsoft.com/office/word/2010/wordml" xmlns:w15="http://schemas.microsoft.com/office/word/2012/wordml" xmlns:w16cex="http://schemas.microsoft.com/office/word/2018/wordml/cex" xmlns:w16cid="http://schemas.microsoft.com/office/word/2016/wordml/cid" xmlns:w16="http://schemas.microsoft.com/office/word/2018/wordml" xmlns:w16sdtdh="http://schemas.microsoft.com/office/word/2020/wordml/sdtdatahash" xmlns:w16se="http://schemas.microsoft.com/office/word/2015/wordml/symex" xmlns:wpg="http://schemas.microsoft.com/office/word/2010/wordprocessingGroup" xmlns:wpi="http://schemas.microsoft.com/office/word/2010/wordprocessingInk" xmlns:wne="http://schemas.microsoft.com/office/word/2006/wordml" xmlns:wps="http://schemas.microsoft.com/office/word/2010/wordprocessingShape" mc:Ignorable="w14 w15 w16se w16cid w16 w16cex w16sdtdh wp14">
   <w:abstractNum w:abstractNumId="0" w15:restartNumberingAfterBreak="0">
+    <w:nsid w:val="069D5DC9"/>
+    <w:multiLevelType w:val="multilevel"/>
+    <w:tmpl w:val="40C66D14"/>
+    <w:lvl w:ilvl="0">
+      <w:start w:val="1"/>
+      <w:numFmt w:val="bullet"/>
+      <w:lvlText w:val=""/>
+      <w:lvlJc w:val="left"/>
+      <w:pPr>
+        <w:tabs>
+          <w:tab w:val="num" w:pos="720"/>
+        </w:tabs>
+        <w:ind w:left="720" w:hanging="360"/>
+      </w:pPr>
+      <w:rPr>
+        <w:rFonts w:ascii="Symbol" w:hAnsi="Symbol" w:hint="default"/>
+        <w:sz w:val="20"/>
+      </w:rPr>
+    </w:lvl>
+    <w:lvl w:ilvl="1" w:tentative="1">
+      <w:start w:val="1"/>
+      <w:numFmt w:val="bullet"/>
+      <w:lvlText w:val="o"/>
+      <w:lvlJc w:val="left"/>
+      <w:pPr>
+        <w:tabs>
+          <w:tab w:val="num" w:pos="1440"/>
+        </w:tabs>
+        <w:ind w:left="1440" w:hanging="360"/>
+      </w:pPr>
+      <w:rPr>
+        <w:rFonts w:ascii="Courier New" w:hAnsi="Courier New" w:hint="default"/>
+        <w:sz w:val="20"/>
+      </w:rPr>
+    </w:lvl>
+    <w:lvl w:ilvl="2" w:tentative="1">
+      <w:start w:val="1"/>
+      <w:numFmt w:val="bullet"/>
+      <w:lvlText w:val=""/>
+      <w:lvlJc w:val="left"/>
+      <w:pPr>
+        <w:tabs>
+          <w:tab w:val="num" w:pos="2160"/>
+        </w:tabs>
+        <w:ind w:left="2160" w:hanging="360"/>
+      </w:pPr>
+      <w:rPr>
+        <w:rFonts w:ascii="Wingdings" w:hAnsi="Wingdings" w:hint="default"/>
+        <w:sz w:val="20"/>
+      </w:rPr>
+    </w:lvl>
+    <w:lvl w:ilvl="3" w:tentative="1">
+      <w:start w:val="1"/>
+      <w:numFmt w:val="bullet"/>
+      <w:lvlText w:val=""/>
+      <w:lvlJc w:val="left"/>
+      <w:pPr>
+        <w:tabs>
+          <w:tab w:val="num" w:pos="2880"/>
+        </w:tabs>
+        <w:ind w:left="2880" w:hanging="360"/>
+      </w:pPr>
+      <w:rPr>
+        <w:rFonts w:ascii="Wingdings" w:hAnsi="Wingdings" w:hint="default"/>
+        <w:sz w:val="20"/>
+      </w:rPr>
+    </w:lvl>
+    <w:lvl w:ilvl="4" w:tentative="1">
+      <w:start w:val="1"/>
+      <w:numFmt w:val="bullet"/>
+      <w:lvlText w:val=""/>
+      <w:lvlJc w:val="left"/>
+      <w:pPr>
+        <w:tabs>
+          <w:tab w:val="num" w:pos="3600"/>
+        </w:tabs>
+        <w:ind w:left="3600" w:hanging="360"/>
+      </w:pPr>
+      <w:rPr>
+        <w:rFonts w:ascii="Wingdings" w:hAnsi="Wingdings" w:hint="default"/>
+        <w:sz w:val="20"/>
+      </w:rPr>
+    </w:lvl>
+    <w:lvl w:ilvl="5" w:tentative="1">
+      <w:start w:val="1"/>
+      <w:numFmt w:val="bullet"/>
+      <w:lvlText w:val=""/>
+      <w:lvlJc w:val="left"/>
+      <w:pPr>
+        <w:tabs>
+          <w:tab w:val="num" w:pos="4320"/>
+        </w:tabs>
+        <w:ind w:left="4320" w:hanging="360"/>
+      </w:pPr>
+      <w:rPr>
+        <w:rFonts w:ascii="Wingdings" w:hAnsi="Wingdings" w:hint="default"/>
+        <w:sz w:val="20"/>
+      </w:rPr>
+    </w:lvl>
+    <w:lvl w:ilvl="6" w:tentative="1">
+      <w:start w:val="1"/>
+      <w:numFmt w:val="bullet"/>
+      <w:lvlText w:val=""/>
+      <w:lvlJc w:val="left"/>
+      <w:pPr>
+        <w:tabs>
+          <w:tab w:val="num" w:pos="5040"/>
+        </w:tabs>
+        <w:ind w:left="5040" w:hanging="360"/>
+      </w:pPr>
+      <w:rPr>
+        <w:rFonts w:ascii="Wingdings" w:hAnsi="Wingdings" w:hint="default"/>
+        <w:sz w:val="20"/>
+      </w:rPr>
+    </w:lvl>
+    <w:lvl w:ilvl="7" w:tentative="1">
+      <w:start w:val="1"/>
+      <w:numFmt w:val="bullet"/>
+      <w:lvlText w:val=""/>
+      <w:lvlJc w:val="left"/>
+      <w:pPr>
+        <w:tabs>
+          <w:tab w:val="num" w:pos="5760"/>
+        </w:tabs>
+        <w:ind w:left="5760" w:hanging="360"/>
+      </w:pPr>
+      <w:rPr>
+        <w:rFonts w:ascii="Wingdings" w:hAnsi="Wingdings" w:hint="default"/>
+        <w:sz w:val="20"/>
+      </w:rPr>
+    </w:lvl>
+    <w:lvl w:ilvl="8" w:tentative="1">
+      <w:start w:val="1"/>
+      <w:numFmt w:val="bullet"/>
+      <w:lvlText w:val=""/>
+      <w:lvlJc w:val="left"/>
+      <w:pPr>
+        <w:tabs>
+          <w:tab w:val="num" w:pos="6480"/>
+        </w:tabs>
+        <w:ind w:left="6480" w:hanging="360"/>
+      </w:pPr>
+      <w:rPr>
+        <w:rFonts w:ascii="Wingdings" w:hAnsi="Wingdings" w:hint="default"/>
+        <w:sz w:val="20"/>
+      </w:rPr>
+    </w:lvl>
+  </w:abstractNum>
+  <w:abstractNum w:abstractNumId="1" w15:restartNumberingAfterBreak="0">
     <w:nsid w:val="09A66459"/>
     <w:multiLevelType w:val="hybridMultilevel"/>
     <w:tmpl w:val="4860F7FE"/>
@@ -8524,7 +9189,7 @@
       </w:pPr>
     </w:lvl>
   </w:abstractNum>
-  <w:abstractNum w:abstractNumId="1" w15:restartNumberingAfterBreak="0">
+  <w:abstractNum w:abstractNumId="2" w15:restartNumberingAfterBreak="0">
     <w:nsid w:val="1E7077B2"/>
     <w:multiLevelType w:val="multilevel"/>
     <w:tmpl w:val="8954BCA2"/>
@@ -8673,7 +9338,7 @@
       </w:rPr>
     </w:lvl>
   </w:abstractNum>
-  <w:abstractNum w:abstractNumId="2" w15:restartNumberingAfterBreak="0">
+  <w:abstractNum w:abstractNumId="3" w15:restartNumberingAfterBreak="0">
     <w:nsid w:val="1F5E0E2E"/>
     <w:multiLevelType w:val="hybridMultilevel"/>
     <w:tmpl w:val="E18AF45E"/>
@@ -8762,7 +9427,7 @@
       </w:pPr>
     </w:lvl>
   </w:abstractNum>
-  <w:abstractNum w:abstractNumId="3" w15:restartNumberingAfterBreak="0">
+  <w:abstractNum w:abstractNumId="4" w15:restartNumberingAfterBreak="0">
     <w:nsid w:val="228F7BD5"/>
     <w:multiLevelType w:val="multilevel"/>
     <w:tmpl w:val="CB446C24"/>
@@ -8911,7 +9576,603 @@
       </w:rPr>
     </w:lvl>
   </w:abstractNum>
-  <w:abstractNum w:abstractNumId="4" w15:restartNumberingAfterBreak="0">
+  <w:abstractNum w:abstractNumId="5" w15:restartNumberingAfterBreak="0">
+    <w:nsid w:val="24BD1B8C"/>
+    <w:multiLevelType w:val="multilevel"/>
+    <w:tmpl w:val="1E2A8C5E"/>
+    <w:lvl w:ilvl="0">
+      <w:start w:val="1"/>
+      <w:numFmt w:val="bullet"/>
+      <w:lvlText w:val=""/>
+      <w:lvlJc w:val="left"/>
+      <w:pPr>
+        <w:tabs>
+          <w:tab w:val="num" w:pos="720"/>
+        </w:tabs>
+        <w:ind w:left="720" w:hanging="360"/>
+      </w:pPr>
+      <w:rPr>
+        <w:rFonts w:ascii="Symbol" w:hAnsi="Symbol" w:hint="default"/>
+        <w:sz w:val="20"/>
+      </w:rPr>
+    </w:lvl>
+    <w:lvl w:ilvl="1" w:tentative="1">
+      <w:start w:val="1"/>
+      <w:numFmt w:val="bullet"/>
+      <w:lvlText w:val="o"/>
+      <w:lvlJc w:val="left"/>
+      <w:pPr>
+        <w:tabs>
+          <w:tab w:val="num" w:pos="1440"/>
+        </w:tabs>
+        <w:ind w:left="1440" w:hanging="360"/>
+      </w:pPr>
+      <w:rPr>
+        <w:rFonts w:ascii="Courier New" w:hAnsi="Courier New" w:hint="default"/>
+        <w:sz w:val="20"/>
+      </w:rPr>
+    </w:lvl>
+    <w:lvl w:ilvl="2" w:tentative="1">
+      <w:start w:val="1"/>
+      <w:numFmt w:val="bullet"/>
+      <w:lvlText w:val=""/>
+      <w:lvlJc w:val="left"/>
+      <w:pPr>
+        <w:tabs>
+          <w:tab w:val="num" w:pos="2160"/>
+        </w:tabs>
+        <w:ind w:left="2160" w:hanging="360"/>
+      </w:pPr>
+      <w:rPr>
+        <w:rFonts w:ascii="Wingdings" w:hAnsi="Wingdings" w:hint="default"/>
+        <w:sz w:val="20"/>
+      </w:rPr>
+    </w:lvl>
+    <w:lvl w:ilvl="3" w:tentative="1">
+      <w:start w:val="1"/>
+      <w:numFmt w:val="bullet"/>
+      <w:lvlText w:val=""/>
+      <w:lvlJc w:val="left"/>
+      <w:pPr>
+        <w:tabs>
+          <w:tab w:val="num" w:pos="2880"/>
+        </w:tabs>
+        <w:ind w:left="2880" w:hanging="360"/>
+      </w:pPr>
+      <w:rPr>
+        <w:rFonts w:ascii="Wingdings" w:hAnsi="Wingdings" w:hint="default"/>
+        <w:sz w:val="20"/>
+      </w:rPr>
+    </w:lvl>
+    <w:lvl w:ilvl="4" w:tentative="1">
+      <w:start w:val="1"/>
+      <w:numFmt w:val="bullet"/>
+      <w:lvlText w:val=""/>
+      <w:lvlJc w:val="left"/>
+      <w:pPr>
+        <w:tabs>
+          <w:tab w:val="num" w:pos="3600"/>
+        </w:tabs>
+        <w:ind w:left="3600" w:hanging="360"/>
+      </w:pPr>
+      <w:rPr>
+        <w:rFonts w:ascii="Wingdings" w:hAnsi="Wingdings" w:hint="default"/>
+        <w:sz w:val="20"/>
+      </w:rPr>
+    </w:lvl>
+    <w:lvl w:ilvl="5" w:tentative="1">
+      <w:start w:val="1"/>
+      <w:numFmt w:val="bullet"/>
+      <w:lvlText w:val=""/>
+      <w:lvlJc w:val="left"/>
+      <w:pPr>
+        <w:tabs>
+          <w:tab w:val="num" w:pos="4320"/>
+        </w:tabs>
+        <w:ind w:left="4320" w:hanging="360"/>
+      </w:pPr>
+      <w:rPr>
+        <w:rFonts w:ascii="Wingdings" w:hAnsi="Wingdings" w:hint="default"/>
+        <w:sz w:val="20"/>
+      </w:rPr>
+    </w:lvl>
+    <w:lvl w:ilvl="6" w:tentative="1">
+      <w:start w:val="1"/>
+      <w:numFmt w:val="bullet"/>
+      <w:lvlText w:val=""/>
+      <w:lvlJc w:val="left"/>
+      <w:pPr>
+        <w:tabs>
+          <w:tab w:val="num" w:pos="5040"/>
+        </w:tabs>
+        <w:ind w:left="5040" w:hanging="360"/>
+      </w:pPr>
+      <w:rPr>
+        <w:rFonts w:ascii="Wingdings" w:hAnsi="Wingdings" w:hint="default"/>
+        <w:sz w:val="20"/>
+      </w:rPr>
+    </w:lvl>
+    <w:lvl w:ilvl="7" w:tentative="1">
+      <w:start w:val="1"/>
+      <w:numFmt w:val="bullet"/>
+      <w:lvlText w:val=""/>
+      <w:lvlJc w:val="left"/>
+      <w:pPr>
+        <w:tabs>
+          <w:tab w:val="num" w:pos="5760"/>
+        </w:tabs>
+        <w:ind w:left="5760" w:hanging="360"/>
+      </w:pPr>
+      <w:rPr>
+        <w:rFonts w:ascii="Wingdings" w:hAnsi="Wingdings" w:hint="default"/>
+        <w:sz w:val="20"/>
+      </w:rPr>
+    </w:lvl>
+    <w:lvl w:ilvl="8" w:tentative="1">
+      <w:start w:val="1"/>
+      <w:numFmt w:val="bullet"/>
+      <w:lvlText w:val=""/>
+      <w:lvlJc w:val="left"/>
+      <w:pPr>
+        <w:tabs>
+          <w:tab w:val="num" w:pos="6480"/>
+        </w:tabs>
+        <w:ind w:left="6480" w:hanging="360"/>
+      </w:pPr>
+      <w:rPr>
+        <w:rFonts w:ascii="Wingdings" w:hAnsi="Wingdings" w:hint="default"/>
+        <w:sz w:val="20"/>
+      </w:rPr>
+    </w:lvl>
+  </w:abstractNum>
+  <w:abstractNum w:abstractNumId="6" w15:restartNumberingAfterBreak="0">
+    <w:nsid w:val="29D05502"/>
+    <w:multiLevelType w:val="multilevel"/>
+    <w:tmpl w:val="F67C86BC"/>
+    <w:lvl w:ilvl="0">
+      <w:start w:val="1"/>
+      <w:numFmt w:val="bullet"/>
+      <w:lvlText w:val=""/>
+      <w:lvlJc w:val="left"/>
+      <w:pPr>
+        <w:tabs>
+          <w:tab w:val="num" w:pos="720"/>
+        </w:tabs>
+        <w:ind w:left="720" w:hanging="360"/>
+      </w:pPr>
+      <w:rPr>
+        <w:rFonts w:ascii="Symbol" w:hAnsi="Symbol" w:hint="default"/>
+        <w:sz w:val="20"/>
+      </w:rPr>
+    </w:lvl>
+    <w:lvl w:ilvl="1" w:tentative="1">
+      <w:start w:val="1"/>
+      <w:numFmt w:val="bullet"/>
+      <w:lvlText w:val="o"/>
+      <w:lvlJc w:val="left"/>
+      <w:pPr>
+        <w:tabs>
+          <w:tab w:val="num" w:pos="1440"/>
+        </w:tabs>
+        <w:ind w:left="1440" w:hanging="360"/>
+      </w:pPr>
+      <w:rPr>
+        <w:rFonts w:ascii="Courier New" w:hAnsi="Courier New" w:hint="default"/>
+        <w:sz w:val="20"/>
+      </w:rPr>
+    </w:lvl>
+    <w:lvl w:ilvl="2" w:tentative="1">
+      <w:start w:val="1"/>
+      <w:numFmt w:val="bullet"/>
+      <w:lvlText w:val=""/>
+      <w:lvlJc w:val="left"/>
+      <w:pPr>
+        <w:tabs>
+          <w:tab w:val="num" w:pos="2160"/>
+        </w:tabs>
+        <w:ind w:left="2160" w:hanging="360"/>
+      </w:pPr>
+      <w:rPr>
+        <w:rFonts w:ascii="Wingdings" w:hAnsi="Wingdings" w:hint="default"/>
+        <w:sz w:val="20"/>
+      </w:rPr>
+    </w:lvl>
+    <w:lvl w:ilvl="3" w:tentative="1">
+      <w:start w:val="1"/>
+      <w:numFmt w:val="bullet"/>
+      <w:lvlText w:val=""/>
+      <w:lvlJc w:val="left"/>
+      <w:pPr>
+        <w:tabs>
+          <w:tab w:val="num" w:pos="2880"/>
+        </w:tabs>
+        <w:ind w:left="2880" w:hanging="360"/>
+      </w:pPr>
+      <w:rPr>
+        <w:rFonts w:ascii="Wingdings" w:hAnsi="Wingdings" w:hint="default"/>
+        <w:sz w:val="20"/>
+      </w:rPr>
+    </w:lvl>
+    <w:lvl w:ilvl="4" w:tentative="1">
+      <w:start w:val="1"/>
+      <w:numFmt w:val="bullet"/>
+      <w:lvlText w:val=""/>
+      <w:lvlJc w:val="left"/>
+      <w:pPr>
+        <w:tabs>
+          <w:tab w:val="num" w:pos="3600"/>
+        </w:tabs>
+        <w:ind w:left="3600" w:hanging="360"/>
+      </w:pPr>
+      <w:rPr>
+        <w:rFonts w:ascii="Wingdings" w:hAnsi="Wingdings" w:hint="default"/>
+        <w:sz w:val="20"/>
+      </w:rPr>
+    </w:lvl>
+    <w:lvl w:ilvl="5" w:tentative="1">
+      <w:start w:val="1"/>
+      <w:numFmt w:val="bullet"/>
+      <w:lvlText w:val=""/>
+      <w:lvlJc w:val="left"/>
+      <w:pPr>
+        <w:tabs>
+          <w:tab w:val="num" w:pos="4320"/>
+        </w:tabs>
+        <w:ind w:left="4320" w:hanging="360"/>
+      </w:pPr>
+      <w:rPr>
+        <w:rFonts w:ascii="Wingdings" w:hAnsi="Wingdings" w:hint="default"/>
+        <w:sz w:val="20"/>
+      </w:rPr>
+    </w:lvl>
+    <w:lvl w:ilvl="6" w:tentative="1">
+      <w:start w:val="1"/>
+      <w:numFmt w:val="bullet"/>
+      <w:lvlText w:val=""/>
+      <w:lvlJc w:val="left"/>
+      <w:pPr>
+        <w:tabs>
+          <w:tab w:val="num" w:pos="5040"/>
+        </w:tabs>
+        <w:ind w:left="5040" w:hanging="360"/>
+      </w:pPr>
+      <w:rPr>
+        <w:rFonts w:ascii="Wingdings" w:hAnsi="Wingdings" w:hint="default"/>
+        <w:sz w:val="20"/>
+      </w:rPr>
+    </w:lvl>
+    <w:lvl w:ilvl="7" w:tentative="1">
+      <w:start w:val="1"/>
+      <w:numFmt w:val="bullet"/>
+      <w:lvlText w:val=""/>
+      <w:lvlJc w:val="left"/>
+      <w:pPr>
+        <w:tabs>
+          <w:tab w:val="num" w:pos="5760"/>
+        </w:tabs>
+        <w:ind w:left="5760" w:hanging="360"/>
+      </w:pPr>
+      <w:rPr>
+        <w:rFonts w:ascii="Wingdings" w:hAnsi="Wingdings" w:hint="default"/>
+        <w:sz w:val="20"/>
+      </w:rPr>
+    </w:lvl>
+    <w:lvl w:ilvl="8" w:tentative="1">
+      <w:start w:val="1"/>
+      <w:numFmt w:val="bullet"/>
+      <w:lvlText w:val=""/>
+      <w:lvlJc w:val="left"/>
+      <w:pPr>
+        <w:tabs>
+          <w:tab w:val="num" w:pos="6480"/>
+        </w:tabs>
+        <w:ind w:left="6480" w:hanging="360"/>
+      </w:pPr>
+      <w:rPr>
+        <w:rFonts w:ascii="Wingdings" w:hAnsi="Wingdings" w:hint="default"/>
+        <w:sz w:val="20"/>
+      </w:rPr>
+    </w:lvl>
+  </w:abstractNum>
+  <w:abstractNum w:abstractNumId="7" w15:restartNumberingAfterBreak="0">
+    <w:nsid w:val="2CD76791"/>
+    <w:multiLevelType w:val="multilevel"/>
+    <w:tmpl w:val="CA5CE614"/>
+    <w:lvl w:ilvl="0">
+      <w:start w:val="1"/>
+      <w:numFmt w:val="bullet"/>
+      <w:lvlText w:val=""/>
+      <w:lvlJc w:val="left"/>
+      <w:pPr>
+        <w:tabs>
+          <w:tab w:val="num" w:pos="720"/>
+        </w:tabs>
+        <w:ind w:left="720" w:hanging="360"/>
+      </w:pPr>
+      <w:rPr>
+        <w:rFonts w:ascii="Symbol" w:hAnsi="Symbol" w:hint="default"/>
+        <w:sz w:val="20"/>
+      </w:rPr>
+    </w:lvl>
+    <w:lvl w:ilvl="1" w:tentative="1">
+      <w:start w:val="1"/>
+      <w:numFmt w:val="bullet"/>
+      <w:lvlText w:val="o"/>
+      <w:lvlJc w:val="left"/>
+      <w:pPr>
+        <w:tabs>
+          <w:tab w:val="num" w:pos="1440"/>
+        </w:tabs>
+        <w:ind w:left="1440" w:hanging="360"/>
+      </w:pPr>
+      <w:rPr>
+        <w:rFonts w:ascii="Courier New" w:hAnsi="Courier New" w:hint="default"/>
+        <w:sz w:val="20"/>
+      </w:rPr>
+    </w:lvl>
+    <w:lvl w:ilvl="2" w:tentative="1">
+      <w:start w:val="1"/>
+      <w:numFmt w:val="bullet"/>
+      <w:lvlText w:val=""/>
+      <w:lvlJc w:val="left"/>
+      <w:pPr>
+        <w:tabs>
+          <w:tab w:val="num" w:pos="2160"/>
+        </w:tabs>
+        <w:ind w:left="2160" w:hanging="360"/>
+      </w:pPr>
+      <w:rPr>
+        <w:rFonts w:ascii="Wingdings" w:hAnsi="Wingdings" w:hint="default"/>
+        <w:sz w:val="20"/>
+      </w:rPr>
+    </w:lvl>
+    <w:lvl w:ilvl="3" w:tentative="1">
+      <w:start w:val="1"/>
+      <w:numFmt w:val="bullet"/>
+      <w:lvlText w:val=""/>
+      <w:lvlJc w:val="left"/>
+      <w:pPr>
+        <w:tabs>
+          <w:tab w:val="num" w:pos="2880"/>
+        </w:tabs>
+        <w:ind w:left="2880" w:hanging="360"/>
+      </w:pPr>
+      <w:rPr>
+        <w:rFonts w:ascii="Wingdings" w:hAnsi="Wingdings" w:hint="default"/>
+        <w:sz w:val="20"/>
+      </w:rPr>
+    </w:lvl>
+    <w:lvl w:ilvl="4" w:tentative="1">
+      <w:start w:val="1"/>
+      <w:numFmt w:val="bullet"/>
+      <w:lvlText w:val=""/>
+      <w:lvlJc w:val="left"/>
+      <w:pPr>
+        <w:tabs>
+          <w:tab w:val="num" w:pos="3600"/>
+        </w:tabs>
+        <w:ind w:left="3600" w:hanging="360"/>
+      </w:pPr>
+      <w:rPr>
+        <w:rFonts w:ascii="Wingdings" w:hAnsi="Wingdings" w:hint="default"/>
+        <w:sz w:val="20"/>
+      </w:rPr>
+    </w:lvl>
+    <w:lvl w:ilvl="5" w:tentative="1">
+      <w:start w:val="1"/>
+      <w:numFmt w:val="bullet"/>
+      <w:lvlText w:val=""/>
+      <w:lvlJc w:val="left"/>
+      <w:pPr>
+        <w:tabs>
+          <w:tab w:val="num" w:pos="4320"/>
+        </w:tabs>
+        <w:ind w:left="4320" w:hanging="360"/>
+      </w:pPr>
+      <w:rPr>
+        <w:rFonts w:ascii="Wingdings" w:hAnsi="Wingdings" w:hint="default"/>
+        <w:sz w:val="20"/>
+      </w:rPr>
+    </w:lvl>
+    <w:lvl w:ilvl="6" w:tentative="1">
+      <w:start w:val="1"/>
+      <w:numFmt w:val="bullet"/>
+      <w:lvlText w:val=""/>
+      <w:lvlJc w:val="left"/>
+      <w:pPr>
+        <w:tabs>
+          <w:tab w:val="num" w:pos="5040"/>
+        </w:tabs>
+        <w:ind w:left="5040" w:hanging="360"/>
+      </w:pPr>
+      <w:rPr>
+        <w:rFonts w:ascii="Wingdings" w:hAnsi="Wingdings" w:hint="default"/>
+        <w:sz w:val="20"/>
+      </w:rPr>
+    </w:lvl>
+    <w:lvl w:ilvl="7" w:tentative="1">
+      <w:start w:val="1"/>
+      <w:numFmt w:val="bullet"/>
+      <w:lvlText w:val=""/>
+      <w:lvlJc w:val="left"/>
+      <w:pPr>
+        <w:tabs>
+          <w:tab w:val="num" w:pos="5760"/>
+        </w:tabs>
+        <w:ind w:left="5760" w:hanging="360"/>
+      </w:pPr>
+      <w:rPr>
+        <w:rFonts w:ascii="Wingdings" w:hAnsi="Wingdings" w:hint="default"/>
+        <w:sz w:val="20"/>
+      </w:rPr>
+    </w:lvl>
+    <w:lvl w:ilvl="8" w:tentative="1">
+      <w:start w:val="1"/>
+      <w:numFmt w:val="bullet"/>
+      <w:lvlText w:val=""/>
+      <w:lvlJc w:val="left"/>
+      <w:pPr>
+        <w:tabs>
+          <w:tab w:val="num" w:pos="6480"/>
+        </w:tabs>
+        <w:ind w:left="6480" w:hanging="360"/>
+      </w:pPr>
+      <w:rPr>
+        <w:rFonts w:ascii="Wingdings" w:hAnsi="Wingdings" w:hint="default"/>
+        <w:sz w:val="20"/>
+      </w:rPr>
+    </w:lvl>
+  </w:abstractNum>
+  <w:abstractNum w:abstractNumId="8" w15:restartNumberingAfterBreak="0">
+    <w:nsid w:val="336975FF"/>
+    <w:multiLevelType w:val="multilevel"/>
+    <w:tmpl w:val="22DA8250"/>
+    <w:lvl w:ilvl="0">
+      <w:start w:val="1"/>
+      <w:numFmt w:val="bullet"/>
+      <w:lvlText w:val=""/>
+      <w:lvlJc w:val="left"/>
+      <w:pPr>
+        <w:tabs>
+          <w:tab w:val="num" w:pos="720"/>
+        </w:tabs>
+        <w:ind w:left="720" w:hanging="360"/>
+      </w:pPr>
+      <w:rPr>
+        <w:rFonts w:ascii="Symbol" w:hAnsi="Symbol" w:hint="default"/>
+        <w:sz w:val="20"/>
+      </w:rPr>
+    </w:lvl>
+    <w:lvl w:ilvl="1" w:tentative="1">
+      <w:start w:val="1"/>
+      <w:numFmt w:val="bullet"/>
+      <w:lvlText w:val="o"/>
+      <w:lvlJc w:val="left"/>
+      <w:pPr>
+        <w:tabs>
+          <w:tab w:val="num" w:pos="1440"/>
+        </w:tabs>
+        <w:ind w:left="1440" w:hanging="360"/>
+      </w:pPr>
+      <w:rPr>
+        <w:rFonts w:ascii="Courier New" w:hAnsi="Courier New" w:hint="default"/>
+        <w:sz w:val="20"/>
+      </w:rPr>
+    </w:lvl>
+    <w:lvl w:ilvl="2" w:tentative="1">
+      <w:start w:val="1"/>
+      <w:numFmt w:val="bullet"/>
+      <w:lvlText w:val=""/>
+      <w:lvlJc w:val="left"/>
+      <w:pPr>
+        <w:tabs>
+          <w:tab w:val="num" w:pos="2160"/>
+        </w:tabs>
+        <w:ind w:left="2160" w:hanging="360"/>
+      </w:pPr>
+      <w:rPr>
+        <w:rFonts w:ascii="Wingdings" w:hAnsi="Wingdings" w:hint="default"/>
+        <w:sz w:val="20"/>
+      </w:rPr>
+    </w:lvl>
+    <w:lvl w:ilvl="3" w:tentative="1">
+      <w:start w:val="1"/>
+      <w:numFmt w:val="bullet"/>
+      <w:lvlText w:val=""/>
+      <w:lvlJc w:val="left"/>
+      <w:pPr>
+        <w:tabs>
+          <w:tab w:val="num" w:pos="2880"/>
+        </w:tabs>
+        <w:ind w:left="2880" w:hanging="360"/>
+      </w:pPr>
+      <w:rPr>
+        <w:rFonts w:ascii="Wingdings" w:hAnsi="Wingdings" w:hint="default"/>
+        <w:sz w:val="20"/>
+      </w:rPr>
+    </w:lvl>
+    <w:lvl w:ilvl="4" w:tentative="1">
+      <w:start w:val="1"/>
+      <w:numFmt w:val="bullet"/>
+      <w:lvlText w:val=""/>
+      <w:lvlJc w:val="left"/>
+      <w:pPr>
+        <w:tabs>
+          <w:tab w:val="num" w:pos="3600"/>
+        </w:tabs>
+        <w:ind w:left="3600" w:hanging="360"/>
+      </w:pPr>
+      <w:rPr>
+        <w:rFonts w:ascii="Wingdings" w:hAnsi="Wingdings" w:hint="default"/>
+        <w:sz w:val="20"/>
+      </w:rPr>
+    </w:lvl>
+    <w:lvl w:ilvl="5" w:tentative="1">
+      <w:start w:val="1"/>
+      <w:numFmt w:val="bullet"/>
+      <w:lvlText w:val=""/>
+      <w:lvlJc w:val="left"/>
+      <w:pPr>
+        <w:tabs>
+          <w:tab w:val="num" w:pos="4320"/>
+        </w:tabs>
+        <w:ind w:left="4320" w:hanging="360"/>
+      </w:pPr>
+      <w:rPr>
+        <w:rFonts w:ascii="Wingdings" w:hAnsi="Wingdings" w:hint="default"/>
+        <w:sz w:val="20"/>
+      </w:rPr>
+    </w:lvl>
+    <w:lvl w:ilvl="6" w:tentative="1">
+      <w:start w:val="1"/>
+      <w:numFmt w:val="bullet"/>
+      <w:lvlText w:val=""/>
+      <w:lvlJc w:val="left"/>
+      <w:pPr>
+        <w:tabs>
+          <w:tab w:val="num" w:pos="5040"/>
+        </w:tabs>
+        <w:ind w:left="5040" w:hanging="360"/>
+      </w:pPr>
+      <w:rPr>
+        <w:rFonts w:ascii="Wingdings" w:hAnsi="Wingdings" w:hint="default"/>
+        <w:sz w:val="20"/>
+      </w:rPr>
+    </w:lvl>
+    <w:lvl w:ilvl="7" w:tentative="1">
+      <w:start w:val="1"/>
+      <w:numFmt w:val="bullet"/>
+      <w:lvlText w:val=""/>
+      <w:lvlJc w:val="left"/>
+      <w:pPr>
+        <w:tabs>
+          <w:tab w:val="num" w:pos="5760"/>
+        </w:tabs>
+        <w:ind w:left="5760" w:hanging="360"/>
+      </w:pPr>
+      <w:rPr>
+        <w:rFonts w:ascii="Wingdings" w:hAnsi="Wingdings" w:hint="default"/>
+        <w:sz w:val="20"/>
+      </w:rPr>
+    </w:lvl>
+    <w:lvl w:ilvl="8" w:tentative="1">
+      <w:start w:val="1"/>
+      <w:numFmt w:val="bullet"/>
+      <w:lvlText w:val=""/>
+      <w:lvlJc w:val="left"/>
+      <w:pPr>
+        <w:tabs>
+          <w:tab w:val="num" w:pos="6480"/>
+        </w:tabs>
+        <w:ind w:left="6480" w:hanging="360"/>
+      </w:pPr>
+      <w:rPr>
+        <w:rFonts w:ascii="Wingdings" w:hAnsi="Wingdings" w:hint="default"/>
+        <w:sz w:val="20"/>
+      </w:rPr>
+    </w:lvl>
+  </w:abstractNum>
+  <w:abstractNum w:abstractNumId="9" w15:restartNumberingAfterBreak="0">
     <w:nsid w:val="3901232A"/>
     <w:multiLevelType w:val="hybridMultilevel"/>
     <w:tmpl w:val="8B10654C"/>
@@ -9024,7 +10285,7 @@
       </w:rPr>
     </w:lvl>
   </w:abstractNum>
-  <w:abstractNum w:abstractNumId="5" w15:restartNumberingAfterBreak="0">
+  <w:abstractNum w:abstractNumId="10" w15:restartNumberingAfterBreak="0">
     <w:nsid w:val="3AFA42CF"/>
     <w:multiLevelType w:val="multilevel"/>
     <w:tmpl w:val="5DFE4C7A"/>
@@ -9173,7 +10434,7 @@
       </w:rPr>
     </w:lvl>
   </w:abstractNum>
-  <w:abstractNum w:abstractNumId="6" w15:restartNumberingAfterBreak="0">
+  <w:abstractNum w:abstractNumId="11" w15:restartNumberingAfterBreak="0">
     <w:nsid w:val="3ED37038"/>
     <w:multiLevelType w:val="hybridMultilevel"/>
     <w:tmpl w:val="33BC4586"/>
@@ -9262,7 +10523,7 @@
       </w:pPr>
     </w:lvl>
   </w:abstractNum>
-  <w:abstractNum w:abstractNumId="7" w15:restartNumberingAfterBreak="0">
+  <w:abstractNum w:abstractNumId="12" w15:restartNumberingAfterBreak="0">
     <w:nsid w:val="3F252B03"/>
     <w:multiLevelType w:val="hybridMultilevel"/>
     <w:tmpl w:val="B4D849DE"/>
@@ -9375,7 +10636,156 @@
       </w:rPr>
     </w:lvl>
   </w:abstractNum>
-  <w:abstractNum w:abstractNumId="8" w15:restartNumberingAfterBreak="0">
+  <w:abstractNum w:abstractNumId="13" w15:restartNumberingAfterBreak="0">
+    <w:nsid w:val="3FD22F94"/>
+    <w:multiLevelType w:val="multilevel"/>
+    <w:tmpl w:val="FEA0E9CA"/>
+    <w:lvl w:ilvl="0">
+      <w:start w:val="1"/>
+      <w:numFmt w:val="bullet"/>
+      <w:lvlText w:val=""/>
+      <w:lvlJc w:val="left"/>
+      <w:pPr>
+        <w:tabs>
+          <w:tab w:val="num" w:pos="720"/>
+        </w:tabs>
+        <w:ind w:left="720" w:hanging="360"/>
+      </w:pPr>
+      <w:rPr>
+        <w:rFonts w:ascii="Symbol" w:hAnsi="Symbol" w:hint="default"/>
+        <w:sz w:val="20"/>
+      </w:rPr>
+    </w:lvl>
+    <w:lvl w:ilvl="1" w:tentative="1">
+      <w:start w:val="1"/>
+      <w:numFmt w:val="bullet"/>
+      <w:lvlText w:val="o"/>
+      <w:lvlJc w:val="left"/>
+      <w:pPr>
+        <w:tabs>
+          <w:tab w:val="num" w:pos="1440"/>
+        </w:tabs>
+        <w:ind w:left="1440" w:hanging="360"/>
+      </w:pPr>
+      <w:rPr>
+        <w:rFonts w:ascii="Courier New" w:hAnsi="Courier New" w:hint="default"/>
+        <w:sz w:val="20"/>
+      </w:rPr>
+    </w:lvl>
+    <w:lvl w:ilvl="2" w:tentative="1">
+      <w:start w:val="1"/>
+      <w:numFmt w:val="bullet"/>
+      <w:lvlText w:val=""/>
+      <w:lvlJc w:val="left"/>
+      <w:pPr>
+        <w:tabs>
+          <w:tab w:val="num" w:pos="2160"/>
+        </w:tabs>
+        <w:ind w:left="2160" w:hanging="360"/>
+      </w:pPr>
+      <w:rPr>
+        <w:rFonts w:ascii="Wingdings" w:hAnsi="Wingdings" w:hint="default"/>
+        <w:sz w:val="20"/>
+      </w:rPr>
+    </w:lvl>
+    <w:lvl w:ilvl="3" w:tentative="1">
+      <w:start w:val="1"/>
+      <w:numFmt w:val="bullet"/>
+      <w:lvlText w:val=""/>
+      <w:lvlJc w:val="left"/>
+      <w:pPr>
+        <w:tabs>
+          <w:tab w:val="num" w:pos="2880"/>
+        </w:tabs>
+        <w:ind w:left="2880" w:hanging="360"/>
+      </w:pPr>
+      <w:rPr>
+        <w:rFonts w:ascii="Wingdings" w:hAnsi="Wingdings" w:hint="default"/>
+        <w:sz w:val="20"/>
+      </w:rPr>
+    </w:lvl>
+    <w:lvl w:ilvl="4" w:tentative="1">
+      <w:start w:val="1"/>
+      <w:numFmt w:val="bullet"/>
+      <w:lvlText w:val=""/>
+      <w:lvlJc w:val="left"/>
+      <w:pPr>
+        <w:tabs>
+          <w:tab w:val="num" w:pos="3600"/>
+        </w:tabs>
+        <w:ind w:left="3600" w:hanging="360"/>
+      </w:pPr>
+      <w:rPr>
+        <w:rFonts w:ascii="Wingdings" w:hAnsi="Wingdings" w:hint="default"/>
+        <w:sz w:val="20"/>
+      </w:rPr>
+    </w:lvl>
+    <w:lvl w:ilvl="5" w:tentative="1">
+      <w:start w:val="1"/>
+      <w:numFmt w:val="bullet"/>
+      <w:lvlText w:val=""/>
+      <w:lvlJc w:val="left"/>
+      <w:pPr>
+        <w:tabs>
+          <w:tab w:val="num" w:pos="4320"/>
+        </w:tabs>
+        <w:ind w:left="4320" w:hanging="360"/>
+      </w:pPr>
+      <w:rPr>
+        <w:rFonts w:ascii="Wingdings" w:hAnsi="Wingdings" w:hint="default"/>
+        <w:sz w:val="20"/>
+      </w:rPr>
+    </w:lvl>
+    <w:lvl w:ilvl="6" w:tentative="1">
+      <w:start w:val="1"/>
+      <w:numFmt w:val="bullet"/>
+      <w:lvlText w:val=""/>
+      <w:lvlJc w:val="left"/>
+      <w:pPr>
+        <w:tabs>
+          <w:tab w:val="num" w:pos="5040"/>
+        </w:tabs>
+        <w:ind w:left="5040" w:hanging="360"/>
+      </w:pPr>
+      <w:rPr>
+        <w:rFonts w:ascii="Wingdings" w:hAnsi="Wingdings" w:hint="default"/>
+        <w:sz w:val="20"/>
+      </w:rPr>
+    </w:lvl>
+    <w:lvl w:ilvl="7" w:tentative="1">
+      <w:start w:val="1"/>
+      <w:numFmt w:val="bullet"/>
+      <w:lvlText w:val=""/>
+      <w:lvlJc w:val="left"/>
+      <w:pPr>
+        <w:tabs>
+          <w:tab w:val="num" w:pos="5760"/>
+        </w:tabs>
+        <w:ind w:left="5760" w:hanging="360"/>
+      </w:pPr>
+      <w:rPr>
+        <w:rFonts w:ascii="Wingdings" w:hAnsi="Wingdings" w:hint="default"/>
+        <w:sz w:val="20"/>
+      </w:rPr>
+    </w:lvl>
+    <w:lvl w:ilvl="8" w:tentative="1">
+      <w:start w:val="1"/>
+      <w:numFmt w:val="bullet"/>
+      <w:lvlText w:val=""/>
+      <w:lvlJc w:val="left"/>
+      <w:pPr>
+        <w:tabs>
+          <w:tab w:val="num" w:pos="6480"/>
+        </w:tabs>
+        <w:ind w:left="6480" w:hanging="360"/>
+      </w:pPr>
+      <w:rPr>
+        <w:rFonts w:ascii="Wingdings" w:hAnsi="Wingdings" w:hint="default"/>
+        <w:sz w:val="20"/>
+      </w:rPr>
+    </w:lvl>
+  </w:abstractNum>
+  <w:abstractNum w:abstractNumId="14" w15:restartNumberingAfterBreak="0">
     <w:nsid w:val="41006F9F"/>
     <w:multiLevelType w:val="multilevel"/>
     <w:tmpl w:val="D29ADD10"/>
@@ -9524,7 +10934,7 @@
       </w:rPr>
     </w:lvl>
   </w:abstractNum>
-  <w:abstractNum w:abstractNumId="9" w15:restartNumberingAfterBreak="0">
+  <w:abstractNum w:abstractNumId="15" w15:restartNumberingAfterBreak="0">
     <w:nsid w:val="420D2706"/>
     <w:multiLevelType w:val="multilevel"/>
     <w:tmpl w:val="8848CDDE"/>
@@ -9673,7 +11083,7 @@
       </w:rPr>
     </w:lvl>
   </w:abstractNum>
-  <w:abstractNum w:abstractNumId="10" w15:restartNumberingAfterBreak="0">
+  <w:abstractNum w:abstractNumId="16" w15:restartNumberingAfterBreak="0">
     <w:nsid w:val="54690BC4"/>
     <w:multiLevelType w:val="multilevel"/>
     <w:tmpl w:val="137E22F0"/>
@@ -9822,7 +11232,156 @@
       </w:rPr>
     </w:lvl>
   </w:abstractNum>
-  <w:abstractNum w:abstractNumId="11" w15:restartNumberingAfterBreak="0">
+  <w:abstractNum w:abstractNumId="17" w15:restartNumberingAfterBreak="0">
+    <w:nsid w:val="78BA42C5"/>
+    <w:multiLevelType w:val="multilevel"/>
+    <w:tmpl w:val="8B92DA96"/>
+    <w:lvl w:ilvl="0">
+      <w:start w:val="1"/>
+      <w:numFmt w:val="bullet"/>
+      <w:lvlText w:val=""/>
+      <w:lvlJc w:val="left"/>
+      <w:pPr>
+        <w:tabs>
+          <w:tab w:val="num" w:pos="720"/>
+        </w:tabs>
+        <w:ind w:left="720" w:hanging="360"/>
+      </w:pPr>
+      <w:rPr>
+        <w:rFonts w:ascii="Symbol" w:hAnsi="Symbol" w:hint="default"/>
+        <w:sz w:val="20"/>
+      </w:rPr>
+    </w:lvl>
+    <w:lvl w:ilvl="1" w:tentative="1">
+      <w:start w:val="1"/>
+      <w:numFmt w:val="bullet"/>
+      <w:lvlText w:val="o"/>
+      <w:lvlJc w:val="left"/>
+      <w:pPr>
+        <w:tabs>
+          <w:tab w:val="num" w:pos="1440"/>
+        </w:tabs>
+        <w:ind w:left="1440" w:hanging="360"/>
+      </w:pPr>
+      <w:rPr>
+        <w:rFonts w:ascii="Courier New" w:hAnsi="Courier New" w:hint="default"/>
+        <w:sz w:val="20"/>
+      </w:rPr>
+    </w:lvl>
+    <w:lvl w:ilvl="2" w:tentative="1">
+      <w:start w:val="1"/>
+      <w:numFmt w:val="bullet"/>
+      <w:lvlText w:val=""/>
+      <w:lvlJc w:val="left"/>
+      <w:pPr>
+        <w:tabs>
+          <w:tab w:val="num" w:pos="2160"/>
+        </w:tabs>
+        <w:ind w:left="2160" w:hanging="360"/>
+      </w:pPr>
+      <w:rPr>
+        <w:rFonts w:ascii="Wingdings" w:hAnsi="Wingdings" w:hint="default"/>
+        <w:sz w:val="20"/>
+      </w:rPr>
+    </w:lvl>
+    <w:lvl w:ilvl="3" w:tentative="1">
+      <w:start w:val="1"/>
+      <w:numFmt w:val="bullet"/>
+      <w:lvlText w:val=""/>
+      <w:lvlJc w:val="left"/>
+      <w:pPr>
+        <w:tabs>
+          <w:tab w:val="num" w:pos="2880"/>
+        </w:tabs>
+        <w:ind w:left="2880" w:hanging="360"/>
+      </w:pPr>
+      <w:rPr>
+        <w:rFonts w:ascii="Wingdings" w:hAnsi="Wingdings" w:hint="default"/>
+        <w:sz w:val="20"/>
+      </w:rPr>
+    </w:lvl>
+    <w:lvl w:ilvl="4" w:tentative="1">
+      <w:start w:val="1"/>
+      <w:numFmt w:val="bullet"/>
+      <w:lvlText w:val=""/>
+      <w:lvlJc w:val="left"/>
+      <w:pPr>
+        <w:tabs>
+          <w:tab w:val="num" w:pos="3600"/>
+        </w:tabs>
+        <w:ind w:left="3600" w:hanging="360"/>
+      </w:pPr>
+      <w:rPr>
+        <w:rFonts w:ascii="Wingdings" w:hAnsi="Wingdings" w:hint="default"/>
+        <w:sz w:val="20"/>
+      </w:rPr>
+    </w:lvl>
+    <w:lvl w:ilvl="5" w:tentative="1">
+      <w:start w:val="1"/>
+      <w:numFmt w:val="bullet"/>
+      <w:lvlText w:val=""/>
+      <w:lvlJc w:val="left"/>
+      <w:pPr>
+        <w:tabs>
+          <w:tab w:val="num" w:pos="4320"/>
+        </w:tabs>
+        <w:ind w:left="4320" w:hanging="360"/>
+      </w:pPr>
+      <w:rPr>
+        <w:rFonts w:ascii="Wingdings" w:hAnsi="Wingdings" w:hint="default"/>
+        <w:sz w:val="20"/>
+      </w:rPr>
+    </w:lvl>
+    <w:lvl w:ilvl="6" w:tentative="1">
+      <w:start w:val="1"/>
+      <w:numFmt w:val="bullet"/>
+      <w:lvlText w:val=""/>
+      <w:lvlJc w:val="left"/>
+      <w:pPr>
+        <w:tabs>
+          <w:tab w:val="num" w:pos="5040"/>
+        </w:tabs>
+        <w:ind w:left="5040" w:hanging="360"/>
+      </w:pPr>
+      <w:rPr>
+        <w:rFonts w:ascii="Wingdings" w:hAnsi="Wingdings" w:hint="default"/>
+        <w:sz w:val="20"/>
+      </w:rPr>
+    </w:lvl>
+    <w:lvl w:ilvl="7" w:tentative="1">
+      <w:start w:val="1"/>
+      <w:numFmt w:val="bullet"/>
+      <w:lvlText w:val=""/>
+      <w:lvlJc w:val="left"/>
+      <w:pPr>
+        <w:tabs>
+          <w:tab w:val="num" w:pos="5760"/>
+        </w:tabs>
+        <w:ind w:left="5760" w:hanging="360"/>
+      </w:pPr>
+      <w:rPr>
+        <w:rFonts w:ascii="Wingdings" w:hAnsi="Wingdings" w:hint="default"/>
+        <w:sz w:val="20"/>
+      </w:rPr>
+    </w:lvl>
+    <w:lvl w:ilvl="8" w:tentative="1">
+      <w:start w:val="1"/>
+      <w:numFmt w:val="bullet"/>
+      <w:lvlText w:val=""/>
+      <w:lvlJc w:val="left"/>
+      <w:pPr>
+        <w:tabs>
+          <w:tab w:val="num" w:pos="6480"/>
+        </w:tabs>
+        <w:ind w:left="6480" w:hanging="360"/>
+      </w:pPr>
+      <w:rPr>
+        <w:rFonts w:ascii="Wingdings" w:hAnsi="Wingdings" w:hint="default"/>
+        <w:sz w:val="20"/>
+      </w:rPr>
+    </w:lvl>
+  </w:abstractNum>
+  <w:abstractNum w:abstractNumId="18" w15:restartNumberingAfterBreak="0">
     <w:nsid w:val="7B356333"/>
     <w:multiLevelType w:val="multilevel"/>
     <w:tmpl w:val="B2807538"/>
@@ -9971,7 +11530,7 @@
       </w:rPr>
     </w:lvl>
   </w:abstractNum>
-  <w:abstractNum w:abstractNumId="12" w15:restartNumberingAfterBreak="0">
+  <w:abstractNum w:abstractNumId="19" w15:restartNumberingAfterBreak="0">
     <w:nsid w:val="7FF40CF5"/>
     <w:multiLevelType w:val="hybridMultilevel"/>
     <w:tmpl w:val="60ECB7C8"/>
@@ -10063,43 +11622,64 @@
     </w:lvl>
   </w:abstractNum>
   <w:num w:numId="1" w16cid:durableId="1933202520">
+    <w:abstractNumId w:val="1"/>
+  </w:num>
+  <w:num w:numId="2" w16cid:durableId="544606274">
+    <w:abstractNumId w:val="3"/>
+  </w:num>
+  <w:num w:numId="3" w16cid:durableId="1727676246">
+    <w:abstractNumId w:val="9"/>
+  </w:num>
+  <w:num w:numId="4" w16cid:durableId="1070931303">
+    <w:abstractNumId w:val="19"/>
+  </w:num>
+  <w:num w:numId="5" w16cid:durableId="1822888237">
+    <w:abstractNumId w:val="11"/>
+  </w:num>
+  <w:num w:numId="6" w16cid:durableId="740444401">
+    <w:abstractNumId w:val="12"/>
+  </w:num>
+  <w:num w:numId="7" w16cid:durableId="1355961488">
+    <w:abstractNumId w:val="15"/>
+  </w:num>
+  <w:num w:numId="8" w16cid:durableId="1431853501">
+    <w:abstractNumId w:val="16"/>
+  </w:num>
+  <w:num w:numId="9" w16cid:durableId="15935336">
+    <w:abstractNumId w:val="14"/>
+  </w:num>
+  <w:num w:numId="10" w16cid:durableId="66533781">
+    <w:abstractNumId w:val="18"/>
+  </w:num>
+  <w:num w:numId="11" w16cid:durableId="1000084741">
+    <w:abstractNumId w:val="4"/>
+  </w:num>
+  <w:num w:numId="12" w16cid:durableId="575894965">
+    <w:abstractNumId w:val="2"/>
+  </w:num>
+  <w:num w:numId="13" w16cid:durableId="1773208438">
+    <w:abstractNumId w:val="10"/>
+  </w:num>
+  <w:num w:numId="14" w16cid:durableId="460464603">
+    <w:abstractNumId w:val="17"/>
+  </w:num>
+  <w:num w:numId="15" w16cid:durableId="628900274">
+    <w:abstractNumId w:val="7"/>
+  </w:num>
+  <w:num w:numId="16" w16cid:durableId="37173462">
     <w:abstractNumId w:val="0"/>
   </w:num>
-  <w:num w:numId="2" w16cid:durableId="544606274">
-    <w:abstractNumId w:val="2"/>
+  <w:num w:numId="17" w16cid:durableId="928081620">
+    <w:abstractNumId w:val="13"/>
   </w:num>
-  <w:num w:numId="3" w16cid:durableId="1727676246">
-    <w:abstractNumId w:val="4"/>
+  <w:num w:numId="18" w16cid:durableId="1019699064">
+    <w:abstractNumId w:val="5"/>
   </w:num>
-  <w:num w:numId="4" w16cid:durableId="1070931303">
-    <w:abstractNumId w:val="12"/>
-  </w:num>
-  <w:num w:numId="5" w16cid:durableId="1822888237">
+  <w:num w:numId="19" w16cid:durableId="941376092">
     <w:abstractNumId w:val="6"/>
   </w:num>
-  <w:num w:numId="6" w16cid:durableId="740444401">
-    <w:abstractNumId w:val="7"/>
-  </w:num>
-  <w:num w:numId="7" w16cid:durableId="1355961488">
-    <w:abstractNumId w:val="9"/>
-  </w:num>
-  <w:num w:numId="8" w16cid:durableId="1431853501">
-    <w:abstractNumId w:val="10"/>
-  </w:num>
-  <w:num w:numId="9" w16cid:durableId="15935336">
+  <w:num w:numId="20" w16cid:durableId="1272778664">
     <w:abstractNumId w:val="8"/>
-  </w:num>
-  <w:num w:numId="10" w16cid:durableId="66533781">
-    <w:abstractNumId w:val="11"/>
-  </w:num>
-  <w:num w:numId="11" w16cid:durableId="1000084741">
-    <w:abstractNumId w:val="3"/>
-  </w:num>
-  <w:num w:numId="12" w16cid:durableId="575894965">
-    <w:abstractNumId w:val="1"/>
-  </w:num>
-  <w:num w:numId="13" w16cid:durableId="1773208438">
-    <w:abstractNumId w:val="5"/>
   </w:num>
 </w:numbering>
 </file>

</xml_diff>

<commit_message>
V20: Update until page 60 of major corrections. Bar numbers are now 8 bars ahead of the original.
</commit_message>
<xml_diff>
--- a/2 Proofreading and Review/LARA Mosaic Maze - Errata_v1 (Page 1-60).docx
+++ b/2 Proofreading and Review/LARA Mosaic Maze - Errata_v1 (Page 1-60).docx
@@ -3574,16 +3574,8 @@
           <w:p>
             <w:pPr>
               <w:jc w:val="center"/>
-              <w:rPr>
-                <w:b/>
-                <w:bCs/>
-              </w:rPr>
-            </w:pPr>
-            <w:r>
-              <w:rPr>
-                <w:b/>
-                <w:bCs/>
-              </w:rPr>
+            </w:pPr>
+            <w:r>
               <w:t>Harp</w:t>
             </w:r>
           </w:p>
@@ -3597,15 +3589,11 @@
               <w:jc w:val="center"/>
               <w:rPr>
                 <w:rFonts w:ascii="Times" w:eastAsia="Times" w:hAnsi="Times" w:cs="Times"/>
-                <w:b/>
-                <w:bCs/>
-              </w:rPr>
-            </w:pPr>
-            <w:r>
-              <w:rPr>
-                <w:rFonts w:ascii="Times" w:eastAsia="Times" w:hAnsi="Times" w:cs="Times"/>
-                <w:b/>
-                <w:bCs/>
+              </w:rPr>
+            </w:pPr>
+            <w:r>
+              <w:rPr>
+                <w:rFonts w:ascii="Times" w:eastAsia="Times" w:hAnsi="Times" w:cs="Times"/>
               </w:rPr>
               <w:t>61</w:t>
             </w:r>
@@ -3619,15 +3607,11 @@
             <w:pPr>
               <w:rPr>
                 <w:rFonts w:ascii="Times" w:eastAsia="Times" w:hAnsi="Times" w:cs="Times"/>
-                <w:b/>
-                <w:bCs/>
-              </w:rPr>
-            </w:pPr>
-            <w:r>
-              <w:rPr>
-                <w:rFonts w:ascii="Times" w:eastAsia="Times" w:hAnsi="Times" w:cs="Times"/>
-                <w:b/>
-                <w:bCs/>
+              </w:rPr>
+            </w:pPr>
+            <w:r>
+              <w:rPr>
+                <w:rFonts w:ascii="Times" w:eastAsia="Times" w:hAnsi="Times" w:cs="Times"/>
               </w:rPr>
               <w:t>RH – Can you check that I read these notes correctly?</w:t>
             </w:r>
@@ -3642,15 +3626,11 @@
               <w:jc w:val="center"/>
               <w:rPr>
                 <w:rFonts w:ascii="Times" w:eastAsia="Times" w:hAnsi="Times" w:cs="Times"/>
-                <w:b/>
-                <w:bCs/>
-              </w:rPr>
-            </w:pPr>
-            <w:r>
-              <w:rPr>
-                <w:rFonts w:ascii="Times" w:eastAsia="Times" w:hAnsi="Times" w:cs="Times"/>
-                <w:b/>
-                <w:bCs/>
+              </w:rPr>
+            </w:pPr>
+            <w:r>
+              <w:rPr>
+                <w:rFonts w:ascii="Times" w:eastAsia="Times" w:hAnsi="Times" w:cs="Times"/>
               </w:rPr>
               <w:t>Should be G and A ¾ flat</w:t>
             </w:r>

</xml_diff>